<commit_message>
Added the Project Report from mb2
</commit_message>
<xml_diff>
--- a/design/Project Report.docx
+++ b/design/Project Report.docx
@@ -30,7 +30,21 @@
         <w:rPr>
           <w:rFonts w:ascii="Times New Roman" w:hAnsi="Times New Roman" w:cs="Times New Roman"/>
         </w:rPr>
-        <w:t>Temp</w:t>
+        <w:t xml:space="preserve">The </w:t>
+      </w:r>
+      <w:r>
+        <w:rPr>
+          <w:rFonts w:ascii="Times New Roman" w:hAnsi="Times New Roman" w:cs="Times New Roman"/>
+          <w:i/>
+          <w:iCs/>
+        </w:rPr>
+        <w:t xml:space="preserve">FantasyFC Application </w:t>
+      </w:r>
+      <w:r>
+        <w:rPr>
+          <w:rFonts w:ascii="Times New Roman" w:hAnsi="Times New Roman" w:cs="Times New Roman"/>
+        </w:rPr>
+        <w:t>is a web-based project that tracks football (American soccer) stats across leagues, seasons, teams, and players. Users who enjoy following along their favorite player or team can create their own and keep track of their stats through different seasons.</w:t>
       </w:r>
     </w:p>
     <w:p>
@@ -66,7 +80,49 @@
         <w:rPr>
           <w:rFonts w:ascii="Times New Roman" w:hAnsi="Times New Roman" w:cs="Times New Roman"/>
         </w:rPr>
-        <w:t>Temp</w:t>
+        <w:t xml:space="preserve">The application was built using python flask, python </w:t>
+      </w:r>
+      <w:proofErr w:type="spellStart"/>
+      <w:r>
+        <w:rPr>
+          <w:rFonts w:ascii="Times New Roman" w:hAnsi="Times New Roman" w:cs="Times New Roman"/>
+        </w:rPr>
+        <w:t>pyodbc</w:t>
+      </w:r>
+      <w:proofErr w:type="spellEnd"/>
+      <w:r>
+        <w:rPr>
+          <w:rFonts w:ascii="Times New Roman" w:hAnsi="Times New Roman" w:cs="Times New Roman"/>
+        </w:rPr>
+        <w:t xml:space="preserve">, react </w:t>
+      </w:r>
+      <w:proofErr w:type="spellStart"/>
+      <w:r>
+        <w:rPr>
+          <w:rFonts w:ascii="Times New Roman" w:hAnsi="Times New Roman" w:cs="Times New Roman"/>
+        </w:rPr>
+        <w:t>js</w:t>
+      </w:r>
+      <w:proofErr w:type="spellEnd"/>
+      <w:r>
+        <w:rPr>
+          <w:rFonts w:ascii="Times New Roman" w:hAnsi="Times New Roman" w:cs="Times New Roman"/>
+        </w:rPr>
+        <w:t xml:space="preserve">, and </w:t>
+      </w:r>
+      <w:proofErr w:type="spellStart"/>
+      <w:r>
+        <w:rPr>
+          <w:rFonts w:ascii="Times New Roman" w:hAnsi="Times New Roman" w:cs="Times New Roman"/>
+        </w:rPr>
+        <w:t>sql</w:t>
+      </w:r>
+      <w:proofErr w:type="spellEnd"/>
+      <w:r>
+        <w:rPr>
+          <w:rFonts w:ascii="Times New Roman" w:hAnsi="Times New Roman" w:cs="Times New Roman"/>
+        </w:rPr>
+        <w:t xml:space="preserve"> server. Python frameworks were used for connection to the database and connection to the frontend. React JS was used to create the entire frontend. SQL Server (TSQL) was used to make the queries to pull from the various tables in the database to present information. </w:t>
       </w:r>
     </w:p>
     <w:p>
@@ -246,7 +302,40 @@
         <w:rPr>
           <w:rFonts w:ascii="Times New Roman" w:hAnsi="Times New Roman" w:cs="Times New Roman"/>
         </w:rPr>
-        <w:t>Temp</w:t>
+        <w:t xml:space="preserve">Artificial Intelligence was utilized throughout the project implementation. We used Claude AI from Anthropic. Claude AI was used to help set up the project initially by helping design the directory hierarchy. Then later on to debug any problems we ran into if we could not debug the code ourselves in a quick timeframe. </w:t>
+      </w:r>
+    </w:p>
+    <w:p>
+      <w:pPr>
+        <w:rPr>
+          <w:rFonts w:ascii="Times New Roman" w:hAnsi="Times New Roman" w:cs="Times New Roman"/>
+        </w:rPr>
+      </w:pPr>
+      <w:r>
+        <w:rPr>
+          <w:rFonts w:ascii="Times New Roman" w:hAnsi="Times New Roman" w:cs="Times New Roman"/>
+        </w:rPr>
+        <w:t xml:space="preserve">We found Claude AI to be exceptional for such minor tasks without many problems. This matched our expectations as we have heard companies that are hiring interns are using Claude AI as part of their job. </w:t>
+      </w:r>
+    </w:p>
+    <w:p>
+      <w:pPr>
+        <w:rPr>
+          <w:rFonts w:ascii="Times New Roman" w:hAnsi="Times New Roman" w:cs="Times New Roman"/>
+        </w:rPr>
+      </w:pPr>
+      <w:r>
+        <w:rPr>
+          <w:rFonts w:ascii="Times New Roman" w:hAnsi="Times New Roman" w:cs="Times New Roman"/>
+        </w:rPr>
+        <w:t xml:space="preserve">There are a few shortcomings when using these tools. Sometimes in debugging it would try and change the code to “fix” the issue, instead of identifying the problem. If we tried using the new code it would cause other issues because it would not match up with something in the backend or frontend, depending on where the issue originates from. Also it is very difficult to debug code </w:t>
+      </w:r>
+      <w:r>
+        <w:rPr>
+          <w:rFonts w:ascii="Times New Roman" w:hAnsi="Times New Roman" w:cs="Times New Roman"/>
+        </w:rPr>
+        <w:lastRenderedPageBreak/>
+        <w:t xml:space="preserve">that you do not look at so we tried to keep the coding aspect of the project to a minimal with the exception of helping writing a script to read csv files into our database. </w:t>
       </w:r>
     </w:p>
     <w:p>

</xml_diff>

<commit_message>
Added some stuff to the report
</commit_message>
<xml_diff>
--- a/design/Project Report.docx
+++ b/design/Project Report.docx
@@ -44,7 +44,19 @@
         <w:rPr>
           <w:rFonts w:ascii="Times New Roman" w:hAnsi="Times New Roman" w:cs="Times New Roman"/>
         </w:rPr>
-        <w:t>is a web-based project that tracks football (American soccer) stats across leagues, seasons, teams, and players. Users who enjoy following along their favorite player or team can create their own and keep track of their stats through different seasons.</w:t>
+        <w:t xml:space="preserve">is a web-based project that tracks football (American soccer) stats across leagues, seasons, teams, and players. Users who enjoy following </w:t>
+      </w:r>
+      <w:r>
+        <w:rPr>
+          <w:rFonts w:ascii="Times New Roman" w:hAnsi="Times New Roman" w:cs="Times New Roman"/>
+        </w:rPr>
+        <w:t>their favorite player or team can create their own team and keep track of their stats across</w:t>
+      </w:r>
+      <w:r>
+        <w:rPr>
+          <w:rFonts w:ascii="Times New Roman" w:hAnsi="Times New Roman" w:cs="Times New Roman"/>
+        </w:rPr>
+        <w:t xml:space="preserve"> seasons.</w:t>
       </w:r>
     </w:p>
     <w:p>
@@ -80,49 +92,55 @@
         <w:rPr>
           <w:rFonts w:ascii="Times New Roman" w:hAnsi="Times New Roman" w:cs="Times New Roman"/>
         </w:rPr>
-        <w:t xml:space="preserve">The application was built using python flask, python </w:t>
-      </w:r>
-      <w:proofErr w:type="spellStart"/>
-      <w:r>
-        <w:rPr>
-          <w:rFonts w:ascii="Times New Roman" w:hAnsi="Times New Roman" w:cs="Times New Roman"/>
-        </w:rPr>
-        <w:t>pyodbc</w:t>
-      </w:r>
-      <w:proofErr w:type="spellEnd"/>
-      <w:r>
-        <w:rPr>
-          <w:rFonts w:ascii="Times New Roman" w:hAnsi="Times New Roman" w:cs="Times New Roman"/>
-        </w:rPr>
-        <w:t xml:space="preserve">, react </w:t>
-      </w:r>
-      <w:proofErr w:type="spellStart"/>
-      <w:r>
-        <w:rPr>
-          <w:rFonts w:ascii="Times New Roman" w:hAnsi="Times New Roman" w:cs="Times New Roman"/>
-        </w:rPr>
-        <w:t>js</w:t>
-      </w:r>
-      <w:proofErr w:type="spellEnd"/>
-      <w:r>
-        <w:rPr>
-          <w:rFonts w:ascii="Times New Roman" w:hAnsi="Times New Roman" w:cs="Times New Roman"/>
-        </w:rPr>
-        <w:t xml:space="preserve">, and </w:t>
-      </w:r>
-      <w:proofErr w:type="spellStart"/>
-      <w:r>
-        <w:rPr>
-          <w:rFonts w:ascii="Times New Roman" w:hAnsi="Times New Roman" w:cs="Times New Roman"/>
-        </w:rPr>
-        <w:t>sql</w:t>
-      </w:r>
-      <w:proofErr w:type="spellEnd"/>
-      <w:r>
-        <w:rPr>
-          <w:rFonts w:ascii="Times New Roman" w:hAnsi="Times New Roman" w:cs="Times New Roman"/>
-        </w:rPr>
-        <w:t xml:space="preserve"> server. Python frameworks were used for connection to the database and connection to the frontend. React JS was used to create the entire frontend. SQL Server (TSQL) was used to make the queries to pull from the various tables in the database to present information. </w:t>
+        <w:t xml:space="preserve">The application was built using </w:t>
+      </w:r>
+      <w:r>
+        <w:rPr>
+          <w:rFonts w:ascii="Times New Roman" w:hAnsi="Times New Roman" w:cs="Times New Roman"/>
+        </w:rPr>
+        <w:t>Python Flask, Python Pyodbc, React.js, and SQL Server</w:t>
+      </w:r>
+      <w:r>
+        <w:rPr>
+          <w:rFonts w:ascii="Times New Roman" w:hAnsi="Times New Roman" w:cs="Times New Roman"/>
+        </w:rPr>
+        <w:t xml:space="preserve">. Python frameworks were used for </w:t>
+      </w:r>
+      <w:r>
+        <w:rPr>
+          <w:rFonts w:ascii="Times New Roman" w:hAnsi="Times New Roman" w:cs="Times New Roman"/>
+        </w:rPr>
+        <w:t xml:space="preserve">connecting to the database and </w:t>
+      </w:r>
+      <w:r>
+        <w:rPr>
+          <w:rFonts w:ascii="Times New Roman" w:hAnsi="Times New Roman" w:cs="Times New Roman"/>
+        </w:rPr>
+        <w:t xml:space="preserve">the frontend. </w:t>
+      </w:r>
+      <w:r>
+        <w:rPr>
+          <w:rFonts w:ascii="Times New Roman" w:hAnsi="Times New Roman" w:cs="Times New Roman"/>
+        </w:rPr>
+        <w:t>React.js was used to build</w:t>
+      </w:r>
+      <w:r>
+        <w:rPr>
+          <w:rFonts w:ascii="Times New Roman" w:hAnsi="Times New Roman" w:cs="Times New Roman"/>
+        </w:rPr>
+        <w:t xml:space="preserve"> the entire frontend. SQL Server (TSQL) was used to </w:t>
+      </w:r>
+      <w:r>
+        <w:rPr>
+          <w:rFonts w:ascii="Times New Roman" w:hAnsi="Times New Roman" w:cs="Times New Roman"/>
+        </w:rPr>
+        <w:t xml:space="preserve">run queries that pull data from </w:t>
+      </w:r>
+      <w:r>
+        <w:rPr>
+          <w:rFonts w:ascii="Times New Roman" w:hAnsi="Times New Roman" w:cs="Times New Roman"/>
+        </w:rPr>
+        <w:t xml:space="preserve">various tables in the database to present information. </w:t>
       </w:r>
     </w:p>
     <w:p>
@@ -157,8 +175,49 @@
       <w:r>
         <w:rPr>
           <w:rFonts w:ascii="Times New Roman" w:hAnsi="Times New Roman" w:cs="Times New Roman"/>
-        </w:rPr>
-        <w:t>Temp</w:t>
+          <w:noProof/>
+        </w:rPr>
+        <w:drawing>
+          <wp:inline distT="0" distB="0" distL="0" distR="0" wp14:anchorId="316813F1" wp14:editId="0FFDE441">
+            <wp:extent cx="5943600" cy="3705225"/>
+            <wp:effectExtent l="0" t="0" r="0" b="9525"/>
+            <wp:docPr id="1520869422" name="Picture 1"/>
+            <wp:cNvGraphicFramePr>
+              <a:graphicFrameLocks xmlns:a="http://schemas.openxmlformats.org/drawingml/2006/main" noChangeAspect="1"/>
+            </wp:cNvGraphicFramePr>
+            <a:graphic xmlns:a="http://schemas.openxmlformats.org/drawingml/2006/main">
+              <a:graphicData uri="http://schemas.openxmlformats.org/drawingml/2006/picture">
+                <pic:pic xmlns:pic="http://schemas.openxmlformats.org/drawingml/2006/picture">
+                  <pic:nvPicPr>
+                    <pic:cNvPr id="1520869422" name="Picture 1520869422"/>
+                    <pic:cNvPicPr/>
+                  </pic:nvPicPr>
+                  <pic:blipFill>
+                    <a:blip r:embed="rId5" cstate="print">
+                      <a:extLst>
+                        <a:ext uri="{28A0092B-C50C-407E-A947-70E740481C1C}">
+                          <a14:useLocalDpi xmlns:a14="http://schemas.microsoft.com/office/drawing/2010/main" val="0"/>
+                        </a:ext>
+                      </a:extLst>
+                    </a:blip>
+                    <a:stretch>
+                      <a:fillRect/>
+                    </a:stretch>
+                  </pic:blipFill>
+                  <pic:spPr>
+                    <a:xfrm>
+                      <a:off x="0" y="0"/>
+                      <a:ext cx="5943600" cy="3705225"/>
+                    </a:xfrm>
+                    <a:prstGeom prst="rect">
+                      <a:avLst/>
+                    </a:prstGeom>
+                  </pic:spPr>
+                </pic:pic>
+              </a:graphicData>
+            </a:graphic>
+          </wp:inline>
+        </w:drawing>
       </w:r>
     </w:p>
     <w:p>
@@ -258,15 +317,2417 @@
     </w:p>
     <w:p>
       <w:pPr>
-        <w:rPr>
-          <w:rFonts w:ascii="Times New Roman" w:hAnsi="Times New Roman" w:cs="Times New Roman"/>
-        </w:rPr>
-      </w:pPr>
-      <w:r>
-        <w:rPr>
-          <w:rFonts w:ascii="Times New Roman" w:hAnsi="Times New Roman" w:cs="Times New Roman"/>
-        </w:rPr>
-        <w:t>Temp</w:t>
+        <w:pStyle w:val="ListParagraph"/>
+        <w:numPr>
+          <w:ilvl w:val="0"/>
+          <w:numId w:val="1"/>
+        </w:numPr>
+        <w:shd w:val="clear" w:color="auto" w:fill="121314"/>
+        <w:spacing w:after="0" w:line="285" w:lineRule="atLeast"/>
+        <w:rPr>
+          <w:rFonts w:ascii="Consolas" w:eastAsia="Times New Roman" w:hAnsi="Consolas" w:cs="Times New Roman"/>
+          <w:color w:val="BBBEBF"/>
+          <w:kern w:val="0"/>
+          <w:sz w:val="21"/>
+          <w:szCs w:val="21"/>
+          <w14:ligatures w14:val="none"/>
+        </w:rPr>
+      </w:pPr>
+      <w:r>
+        <w:rPr>
+          <w:rFonts w:ascii="Consolas" w:eastAsia="Times New Roman" w:hAnsi="Consolas" w:cs="Times New Roman"/>
+          <w:color w:val="A5D6FF"/>
+          <w:kern w:val="0"/>
+          <w:sz w:val="21"/>
+          <w:szCs w:val="21"/>
+          <w14:ligatures w14:val="none"/>
+        </w:rPr>
+        <w:lastRenderedPageBreak/>
+        <w:t>SELECT P.PlayerID, P.PlayerName,  </w:t>
+      </w:r>
+    </w:p>
+    <w:p>
+      <w:pPr>
+        <w:shd w:val="clear" w:color="auto" w:fill="121314"/>
+        <w:spacing w:after="0" w:line="285" w:lineRule="atLeast"/>
+        <w:ind w:left="360"/>
+        <w:rPr>
+          <w:rFonts w:ascii="Consolas" w:eastAsia="Times New Roman" w:hAnsi="Consolas" w:cs="Times New Roman"/>
+          <w:color w:val="BBBEBF"/>
+          <w:kern w:val="0"/>
+          <w:sz w:val="21"/>
+          <w:szCs w:val="21"/>
+          <w14:ligatures w14:val="none"/>
+        </w:rPr>
+      </w:pPr>
+      <w:r>
+        <w:rPr>
+          <w:rFonts w:ascii="Consolas" w:eastAsia="Times New Roman" w:hAnsi="Consolas" w:cs="Times New Roman"/>
+          <w:color w:val="A5D6FF"/>
+          <w:kern w:val="0"/>
+          <w:sz w:val="21"/>
+          <w:szCs w:val="21"/>
+          <w14:ligatures w14:val="none"/>
+        </w:rPr>
+        <w:t xml:space="preserve">                (YEAR(SYSDATETIMEOFFSET()) - YEAR(P.BirthDate)) AS PlayerAge, </w:t>
+      </w:r>
+    </w:p>
+    <w:p>
+      <w:pPr>
+        <w:shd w:val="clear" w:color="auto" w:fill="121314"/>
+        <w:spacing w:after="0" w:line="285" w:lineRule="atLeast"/>
+        <w:ind w:left="360"/>
+        <w:rPr>
+          <w:rFonts w:ascii="Consolas" w:eastAsia="Times New Roman" w:hAnsi="Consolas" w:cs="Times New Roman"/>
+          <w:color w:val="BBBEBF"/>
+          <w:kern w:val="0"/>
+          <w:sz w:val="21"/>
+          <w:szCs w:val="21"/>
+          <w14:ligatures w14:val="none"/>
+        </w:rPr>
+      </w:pPr>
+      <w:r>
+        <w:rPr>
+          <w:rFonts w:ascii="Consolas" w:eastAsia="Times New Roman" w:hAnsi="Consolas" w:cs="Times New Roman"/>
+          <w:color w:val="A5D6FF"/>
+          <w:kern w:val="0"/>
+          <w:sz w:val="21"/>
+          <w:szCs w:val="21"/>
+          <w14:ligatures w14:val="none"/>
+        </w:rPr>
+        <w:t>                P.Position, TP.TeamPlayerID, S.SeasonID,</w:t>
+      </w:r>
+    </w:p>
+    <w:p>
+      <w:pPr>
+        <w:shd w:val="clear" w:color="auto" w:fill="121314"/>
+        <w:spacing w:after="0" w:line="285" w:lineRule="atLeast"/>
+        <w:ind w:left="360"/>
+        <w:rPr>
+          <w:rFonts w:ascii="Consolas" w:eastAsia="Times New Roman" w:hAnsi="Consolas" w:cs="Times New Roman"/>
+          <w:color w:val="BBBEBF"/>
+          <w:kern w:val="0"/>
+          <w:sz w:val="21"/>
+          <w:szCs w:val="21"/>
+          <w14:ligatures w14:val="none"/>
+        </w:rPr>
+      </w:pPr>
+      <w:r>
+        <w:rPr>
+          <w:rFonts w:ascii="Consolas" w:eastAsia="Times New Roman" w:hAnsi="Consolas" w:cs="Times New Roman"/>
+          <w:color w:val="A5D6FF"/>
+          <w:kern w:val="0"/>
+          <w:sz w:val="21"/>
+          <w:szCs w:val="21"/>
+          <w14:ligatures w14:val="none"/>
+        </w:rPr>
+        <w:t>                SUM(PM.Goals)   AS TotalGoals,</w:t>
+      </w:r>
+    </w:p>
+    <w:p>
+      <w:pPr>
+        <w:shd w:val="clear" w:color="auto" w:fill="121314"/>
+        <w:spacing w:after="0" w:line="285" w:lineRule="atLeast"/>
+        <w:ind w:left="360"/>
+        <w:rPr>
+          <w:rFonts w:ascii="Consolas" w:eastAsia="Times New Roman" w:hAnsi="Consolas" w:cs="Times New Roman"/>
+          <w:color w:val="BBBEBF"/>
+          <w:kern w:val="0"/>
+          <w:sz w:val="21"/>
+          <w:szCs w:val="21"/>
+          <w14:ligatures w14:val="none"/>
+        </w:rPr>
+      </w:pPr>
+      <w:r>
+        <w:rPr>
+          <w:rFonts w:ascii="Consolas" w:eastAsia="Times New Roman" w:hAnsi="Consolas" w:cs="Times New Roman"/>
+          <w:color w:val="A5D6FF"/>
+          <w:kern w:val="0"/>
+          <w:sz w:val="21"/>
+          <w:szCs w:val="21"/>
+          <w14:ligatures w14:val="none"/>
+        </w:rPr>
+        <w:t>                SUM(PM.Assists) AS TotalAssists</w:t>
+      </w:r>
+    </w:p>
+    <w:p>
+      <w:pPr>
+        <w:shd w:val="clear" w:color="auto" w:fill="121314"/>
+        <w:spacing w:after="0" w:line="285" w:lineRule="atLeast"/>
+        <w:ind w:left="360"/>
+        <w:rPr>
+          <w:rFonts w:ascii="Consolas" w:eastAsia="Times New Roman" w:hAnsi="Consolas" w:cs="Times New Roman"/>
+          <w:color w:val="BBBEBF"/>
+          <w:kern w:val="0"/>
+          <w:sz w:val="21"/>
+          <w:szCs w:val="21"/>
+          <w14:ligatures w14:val="none"/>
+        </w:rPr>
+      </w:pPr>
+      <w:r>
+        <w:rPr>
+          <w:rFonts w:ascii="Consolas" w:eastAsia="Times New Roman" w:hAnsi="Consolas" w:cs="Times New Roman"/>
+          <w:color w:val="A5D6FF"/>
+          <w:kern w:val="0"/>
+          <w:sz w:val="21"/>
+          <w:szCs w:val="21"/>
+          <w14:ligatures w14:val="none"/>
+        </w:rPr>
+        <w:t>               FROM FantasyFootball.Player P</w:t>
+      </w:r>
+    </w:p>
+    <w:p>
+      <w:pPr>
+        <w:shd w:val="clear" w:color="auto" w:fill="121314"/>
+        <w:spacing w:after="0" w:line="285" w:lineRule="atLeast"/>
+        <w:ind w:left="360"/>
+        <w:rPr>
+          <w:rFonts w:ascii="Consolas" w:eastAsia="Times New Roman" w:hAnsi="Consolas" w:cs="Times New Roman"/>
+          <w:color w:val="BBBEBF"/>
+          <w:kern w:val="0"/>
+          <w:sz w:val="21"/>
+          <w:szCs w:val="21"/>
+          <w14:ligatures w14:val="none"/>
+        </w:rPr>
+      </w:pPr>
+      <w:r>
+        <w:rPr>
+          <w:rFonts w:ascii="Consolas" w:eastAsia="Times New Roman" w:hAnsi="Consolas" w:cs="Times New Roman"/>
+          <w:color w:val="A5D6FF"/>
+          <w:kern w:val="0"/>
+          <w:sz w:val="21"/>
+          <w:szCs w:val="21"/>
+          <w14:ligatures w14:val="none"/>
+        </w:rPr>
+        <w:t>                INNER JOIN FantasyFootball.TeamPlayer TP ON TP.PlayerID = P.PlayerID</w:t>
+      </w:r>
+    </w:p>
+    <w:p>
+      <w:pPr>
+        <w:shd w:val="clear" w:color="auto" w:fill="121314"/>
+        <w:spacing w:after="0" w:line="285" w:lineRule="atLeast"/>
+        <w:ind w:left="360"/>
+        <w:rPr>
+          <w:rFonts w:ascii="Consolas" w:eastAsia="Times New Roman" w:hAnsi="Consolas" w:cs="Times New Roman"/>
+          <w:color w:val="BBBEBF"/>
+          <w:kern w:val="0"/>
+          <w:sz w:val="21"/>
+          <w:szCs w:val="21"/>
+          <w14:ligatures w14:val="none"/>
+        </w:rPr>
+      </w:pPr>
+      <w:r>
+        <w:rPr>
+          <w:rFonts w:ascii="Consolas" w:eastAsia="Times New Roman" w:hAnsi="Consolas" w:cs="Times New Roman"/>
+          <w:color w:val="A5D6FF"/>
+          <w:kern w:val="0"/>
+          <w:sz w:val="21"/>
+          <w:szCs w:val="21"/>
+          <w14:ligatures w14:val="none"/>
+        </w:rPr>
+        <w:t>                INNER JOIN FantasyFootball.PlayerMatch PM ON PM.TeamPlayerID = TP.TeamPlayerID</w:t>
+      </w:r>
+    </w:p>
+    <w:p>
+      <w:pPr>
+        <w:shd w:val="clear" w:color="auto" w:fill="121314"/>
+        <w:spacing w:after="0" w:line="285" w:lineRule="atLeast"/>
+        <w:ind w:left="360"/>
+        <w:rPr>
+          <w:rFonts w:ascii="Consolas" w:eastAsia="Times New Roman" w:hAnsi="Consolas" w:cs="Times New Roman"/>
+          <w:color w:val="BBBEBF"/>
+          <w:kern w:val="0"/>
+          <w:sz w:val="21"/>
+          <w:szCs w:val="21"/>
+          <w14:ligatures w14:val="none"/>
+        </w:rPr>
+      </w:pPr>
+      <w:r>
+        <w:rPr>
+          <w:rFonts w:ascii="Consolas" w:eastAsia="Times New Roman" w:hAnsi="Consolas" w:cs="Times New Roman"/>
+          <w:color w:val="A5D6FF"/>
+          <w:kern w:val="0"/>
+          <w:sz w:val="21"/>
+          <w:szCs w:val="21"/>
+          <w14:ligatures w14:val="none"/>
+        </w:rPr>
+        <w:t>                INNER JOIN FantasyFootball.TeamSeason TS ON TS.TeamSeasonID = TP.TeamSeasonID</w:t>
+      </w:r>
+    </w:p>
+    <w:p>
+      <w:pPr>
+        <w:shd w:val="clear" w:color="auto" w:fill="121314"/>
+        <w:spacing w:after="0" w:line="285" w:lineRule="atLeast"/>
+        <w:ind w:left="360"/>
+        <w:rPr>
+          <w:rFonts w:ascii="Consolas" w:eastAsia="Times New Roman" w:hAnsi="Consolas" w:cs="Times New Roman"/>
+          <w:color w:val="BBBEBF"/>
+          <w:kern w:val="0"/>
+          <w:sz w:val="21"/>
+          <w:szCs w:val="21"/>
+          <w14:ligatures w14:val="none"/>
+        </w:rPr>
+      </w:pPr>
+      <w:r>
+        <w:rPr>
+          <w:rFonts w:ascii="Consolas" w:eastAsia="Times New Roman" w:hAnsi="Consolas" w:cs="Times New Roman"/>
+          <w:color w:val="A5D6FF"/>
+          <w:kern w:val="0"/>
+          <w:sz w:val="21"/>
+          <w:szCs w:val="21"/>
+          <w14:ligatures w14:val="none"/>
+        </w:rPr>
+        <w:t>                INNER JOIN FantasyFootball.Team T ON T.TeamID = TS.TeamID</w:t>
+      </w:r>
+    </w:p>
+    <w:p>
+      <w:pPr>
+        <w:shd w:val="clear" w:color="auto" w:fill="121314"/>
+        <w:spacing w:after="0" w:line="285" w:lineRule="atLeast"/>
+        <w:ind w:left="360"/>
+        <w:rPr>
+          <w:rFonts w:ascii="Consolas" w:eastAsia="Times New Roman" w:hAnsi="Consolas" w:cs="Times New Roman"/>
+          <w:color w:val="BBBEBF"/>
+          <w:kern w:val="0"/>
+          <w:sz w:val="21"/>
+          <w:szCs w:val="21"/>
+          <w14:ligatures w14:val="none"/>
+        </w:rPr>
+      </w:pPr>
+      <w:r>
+        <w:rPr>
+          <w:rFonts w:ascii="Consolas" w:eastAsia="Times New Roman" w:hAnsi="Consolas" w:cs="Times New Roman"/>
+          <w:color w:val="A5D6FF"/>
+          <w:kern w:val="0"/>
+          <w:sz w:val="21"/>
+          <w:szCs w:val="21"/>
+          <w14:ligatures w14:val="none"/>
+        </w:rPr>
+        <w:t>                INNER JOIN FantasyFootball.Season S ON S.SeasonID = TS.SeasonID</w:t>
+      </w:r>
+    </w:p>
+    <w:p>
+      <w:pPr>
+        <w:shd w:val="clear" w:color="auto" w:fill="121314"/>
+        <w:spacing w:after="0" w:line="285" w:lineRule="atLeast"/>
+        <w:ind w:left="360"/>
+        <w:rPr>
+          <w:rFonts w:ascii="Consolas" w:eastAsia="Times New Roman" w:hAnsi="Consolas" w:cs="Times New Roman"/>
+          <w:color w:val="BBBEBF"/>
+          <w:kern w:val="0"/>
+          <w:sz w:val="21"/>
+          <w:szCs w:val="21"/>
+          <w14:ligatures w14:val="none"/>
+        </w:rPr>
+      </w:pPr>
+      <w:r>
+        <w:rPr>
+          <w:rFonts w:ascii="Consolas" w:eastAsia="Times New Roman" w:hAnsi="Consolas" w:cs="Times New Roman"/>
+          <w:color w:val="A5D6FF"/>
+          <w:kern w:val="0"/>
+          <w:sz w:val="21"/>
+          <w:szCs w:val="21"/>
+          <w14:ligatures w14:val="none"/>
+        </w:rPr>
+        <w:t>                INNER JOIN FantasyFootball.League L ON L.LeagueID = S.LeagueID</w:t>
+      </w:r>
+    </w:p>
+    <w:p>
+      <w:pPr>
+        <w:shd w:val="clear" w:color="auto" w:fill="121314"/>
+        <w:spacing w:after="0" w:line="285" w:lineRule="atLeast"/>
+        <w:ind w:left="360"/>
+        <w:rPr>
+          <w:rFonts w:ascii="Consolas" w:eastAsia="Times New Roman" w:hAnsi="Consolas" w:cs="Times New Roman"/>
+          <w:color w:val="A5D6FF"/>
+          <w:kern w:val="0"/>
+          <w:sz w:val="21"/>
+          <w:szCs w:val="21"/>
+          <w14:ligatures w14:val="none"/>
+        </w:rPr>
+      </w:pPr>
+      <w:r>
+        <w:rPr>
+          <w:rFonts w:ascii="Consolas" w:eastAsia="Times New Roman" w:hAnsi="Consolas" w:cs="Times New Roman"/>
+          <w:color w:val="A5D6FF"/>
+          <w:kern w:val="0"/>
+          <w:sz w:val="21"/>
+          <w:szCs w:val="21"/>
+          <w14:ligatures w14:val="none"/>
+        </w:rPr>
+        <w:t>               WHERE 1=1</w:t>
+      </w:r>
+    </w:p>
+    <w:p>
+      <w:pPr>
+        <w:shd w:val="clear" w:color="auto" w:fill="121314"/>
+        <w:spacing w:after="0" w:line="285" w:lineRule="atLeast"/>
+        <w:ind w:left="360"/>
+        <w:rPr>
+          <w:rFonts w:ascii="Consolas" w:eastAsia="Times New Roman" w:hAnsi="Consolas" w:cs="Times New Roman"/>
+          <w:color w:val="BBBEBF"/>
+          <w:kern w:val="0"/>
+          <w:sz w:val="21"/>
+          <w:szCs w:val="21"/>
+          <w14:ligatures w14:val="none"/>
+        </w:rPr>
+      </w:pPr>
+      <w:r>
+        <w:rPr>
+          <w:rFonts w:ascii="Consolas" w:eastAsia="Times New Roman" w:hAnsi="Consolas" w:cs="Times New Roman"/>
+          <w:color w:val="BBBEBF"/>
+          <w:kern w:val="0"/>
+          <w:sz w:val="21"/>
+          <w:szCs w:val="21"/>
+          <w14:ligatures w14:val="none"/>
+        </w:rPr>
+        <w:t>if data["playerName"]:</w:t>
+      </w:r>
+    </w:p>
+    <w:p>
+      <w:pPr>
+        <w:shd w:val="clear" w:color="auto" w:fill="121314"/>
+        <w:spacing w:after="0" w:line="285" w:lineRule="atLeast"/>
+        <w:ind w:left="360"/>
+        <w:rPr>
+          <w:rFonts w:ascii="Consolas" w:eastAsia="Times New Roman" w:hAnsi="Consolas" w:cs="Times New Roman"/>
+          <w:color w:val="BBBEBF"/>
+          <w:kern w:val="0"/>
+          <w:sz w:val="21"/>
+          <w:szCs w:val="21"/>
+          <w14:ligatures w14:val="none"/>
+        </w:rPr>
+      </w:pPr>
+      <w:r>
+        <w:rPr>
+          <w:rFonts w:ascii="Consolas" w:eastAsia="Times New Roman" w:hAnsi="Consolas" w:cs="Times New Roman"/>
+          <w:color w:val="BBBEBF"/>
+          <w:kern w:val="0"/>
+          <w:sz w:val="21"/>
+          <w:szCs w:val="21"/>
+          <w14:ligatures w14:val="none"/>
+        </w:rPr>
+        <w:t>        query += " AND P.PlayerName LIKE ?"</w:t>
+      </w:r>
+    </w:p>
+    <w:p>
+      <w:pPr>
+        <w:shd w:val="clear" w:color="auto" w:fill="121314"/>
+        <w:spacing w:after="0" w:line="285" w:lineRule="atLeast"/>
+        <w:ind w:left="360"/>
+        <w:rPr>
+          <w:rFonts w:ascii="Consolas" w:eastAsia="Times New Roman" w:hAnsi="Consolas" w:cs="Times New Roman"/>
+          <w:color w:val="BBBEBF"/>
+          <w:kern w:val="0"/>
+          <w:sz w:val="21"/>
+          <w:szCs w:val="21"/>
+          <w14:ligatures w14:val="none"/>
+        </w:rPr>
+      </w:pPr>
+      <w:r>
+        <w:rPr>
+          <w:rFonts w:ascii="Consolas" w:eastAsia="Times New Roman" w:hAnsi="Consolas" w:cs="Times New Roman"/>
+          <w:color w:val="BBBEBF"/>
+          <w:kern w:val="0"/>
+          <w:sz w:val="21"/>
+          <w:szCs w:val="21"/>
+          <w14:ligatures w14:val="none"/>
+        </w:rPr>
+        <w:t>        params.append(f"%{data['playerName']}%")</w:t>
+      </w:r>
+    </w:p>
+    <w:p>
+      <w:pPr>
+        <w:shd w:val="clear" w:color="auto" w:fill="121314"/>
+        <w:spacing w:after="0" w:line="285" w:lineRule="atLeast"/>
+        <w:ind w:left="360"/>
+        <w:rPr>
+          <w:rFonts w:ascii="Consolas" w:eastAsia="Times New Roman" w:hAnsi="Consolas" w:cs="Times New Roman"/>
+          <w:color w:val="BBBEBF"/>
+          <w:kern w:val="0"/>
+          <w:sz w:val="21"/>
+          <w:szCs w:val="21"/>
+          <w14:ligatures w14:val="none"/>
+        </w:rPr>
+      </w:pPr>
+      <w:r>
+        <w:rPr>
+          <w:rFonts w:ascii="Consolas" w:eastAsia="Times New Roman" w:hAnsi="Consolas" w:cs="Times New Roman"/>
+          <w:color w:val="BBBEBF"/>
+          <w:kern w:val="0"/>
+          <w:sz w:val="21"/>
+          <w:szCs w:val="21"/>
+          <w14:ligatures w14:val="none"/>
+        </w:rPr>
+        <w:t>    if data["teamID"]:</w:t>
+      </w:r>
+    </w:p>
+    <w:p>
+      <w:pPr>
+        <w:shd w:val="clear" w:color="auto" w:fill="121314"/>
+        <w:spacing w:after="0" w:line="285" w:lineRule="atLeast"/>
+        <w:ind w:left="360"/>
+        <w:rPr>
+          <w:rFonts w:ascii="Consolas" w:eastAsia="Times New Roman" w:hAnsi="Consolas" w:cs="Times New Roman"/>
+          <w:color w:val="BBBEBF"/>
+          <w:kern w:val="0"/>
+          <w:sz w:val="21"/>
+          <w:szCs w:val="21"/>
+          <w14:ligatures w14:val="none"/>
+        </w:rPr>
+      </w:pPr>
+      <w:r>
+        <w:rPr>
+          <w:rFonts w:ascii="Consolas" w:eastAsia="Times New Roman" w:hAnsi="Consolas" w:cs="Times New Roman"/>
+          <w:color w:val="BBBEBF"/>
+          <w:kern w:val="0"/>
+          <w:sz w:val="21"/>
+          <w:szCs w:val="21"/>
+          <w14:ligatures w14:val="none"/>
+        </w:rPr>
+        <w:t>        query += " AND T.TeamID = ?"</w:t>
+      </w:r>
+    </w:p>
+    <w:p>
+      <w:pPr>
+        <w:shd w:val="clear" w:color="auto" w:fill="121314"/>
+        <w:spacing w:after="0" w:line="285" w:lineRule="atLeast"/>
+        <w:ind w:left="360"/>
+        <w:rPr>
+          <w:rFonts w:ascii="Consolas" w:eastAsia="Times New Roman" w:hAnsi="Consolas" w:cs="Times New Roman"/>
+          <w:color w:val="BBBEBF"/>
+          <w:kern w:val="0"/>
+          <w:sz w:val="21"/>
+          <w:szCs w:val="21"/>
+          <w14:ligatures w14:val="none"/>
+        </w:rPr>
+      </w:pPr>
+      <w:r>
+        <w:rPr>
+          <w:rFonts w:ascii="Consolas" w:eastAsia="Times New Roman" w:hAnsi="Consolas" w:cs="Times New Roman"/>
+          <w:color w:val="BBBEBF"/>
+          <w:kern w:val="0"/>
+          <w:sz w:val="21"/>
+          <w:szCs w:val="21"/>
+          <w14:ligatures w14:val="none"/>
+        </w:rPr>
+        <w:t>        params.append(data['teamID'])</w:t>
+      </w:r>
+    </w:p>
+    <w:p>
+      <w:pPr>
+        <w:shd w:val="clear" w:color="auto" w:fill="121314"/>
+        <w:spacing w:after="0" w:line="285" w:lineRule="atLeast"/>
+        <w:ind w:left="360"/>
+        <w:rPr>
+          <w:rFonts w:ascii="Consolas" w:eastAsia="Times New Roman" w:hAnsi="Consolas" w:cs="Times New Roman"/>
+          <w:color w:val="BBBEBF"/>
+          <w:kern w:val="0"/>
+          <w:sz w:val="21"/>
+          <w:szCs w:val="21"/>
+          <w14:ligatures w14:val="none"/>
+        </w:rPr>
+      </w:pPr>
+      <w:r>
+        <w:rPr>
+          <w:rFonts w:ascii="Consolas" w:eastAsia="Times New Roman" w:hAnsi="Consolas" w:cs="Times New Roman"/>
+          <w:color w:val="BBBEBF"/>
+          <w:kern w:val="0"/>
+          <w:sz w:val="21"/>
+          <w:szCs w:val="21"/>
+          <w14:ligatures w14:val="none"/>
+        </w:rPr>
+        <w:t>    if data["leagueID"]:</w:t>
+      </w:r>
+    </w:p>
+    <w:p>
+      <w:pPr>
+        <w:shd w:val="clear" w:color="auto" w:fill="121314"/>
+        <w:spacing w:after="0" w:line="285" w:lineRule="atLeast"/>
+        <w:ind w:left="360"/>
+        <w:rPr>
+          <w:rFonts w:ascii="Consolas" w:eastAsia="Times New Roman" w:hAnsi="Consolas" w:cs="Times New Roman"/>
+          <w:color w:val="BBBEBF"/>
+          <w:kern w:val="0"/>
+          <w:sz w:val="21"/>
+          <w:szCs w:val="21"/>
+          <w14:ligatures w14:val="none"/>
+        </w:rPr>
+      </w:pPr>
+      <w:r>
+        <w:rPr>
+          <w:rFonts w:ascii="Consolas" w:eastAsia="Times New Roman" w:hAnsi="Consolas" w:cs="Times New Roman"/>
+          <w:color w:val="BBBEBF"/>
+          <w:kern w:val="0"/>
+          <w:sz w:val="21"/>
+          <w:szCs w:val="21"/>
+          <w14:ligatures w14:val="none"/>
+        </w:rPr>
+        <w:t>        query += " AND L.LeagueID = ?"</w:t>
+      </w:r>
+    </w:p>
+    <w:p>
+      <w:pPr>
+        <w:shd w:val="clear" w:color="auto" w:fill="121314"/>
+        <w:spacing w:after="0" w:line="285" w:lineRule="atLeast"/>
+        <w:ind w:left="360"/>
+        <w:rPr>
+          <w:rFonts w:ascii="Consolas" w:eastAsia="Times New Roman" w:hAnsi="Consolas" w:cs="Times New Roman"/>
+          <w:color w:val="BBBEBF"/>
+          <w:kern w:val="0"/>
+          <w:sz w:val="21"/>
+          <w:szCs w:val="21"/>
+          <w14:ligatures w14:val="none"/>
+        </w:rPr>
+      </w:pPr>
+      <w:r>
+        <w:rPr>
+          <w:rFonts w:ascii="Consolas" w:eastAsia="Times New Roman" w:hAnsi="Consolas" w:cs="Times New Roman"/>
+          <w:color w:val="BBBEBF"/>
+          <w:kern w:val="0"/>
+          <w:sz w:val="21"/>
+          <w:szCs w:val="21"/>
+          <w14:ligatures w14:val="none"/>
+        </w:rPr>
+        <w:t>        params.append(data['leagueID'])</w:t>
+      </w:r>
+    </w:p>
+    <w:p>
+      <w:pPr>
+        <w:shd w:val="clear" w:color="auto" w:fill="121314"/>
+        <w:spacing w:after="0" w:line="285" w:lineRule="atLeast"/>
+        <w:ind w:left="360"/>
+        <w:rPr>
+          <w:rFonts w:ascii="Consolas" w:eastAsia="Times New Roman" w:hAnsi="Consolas" w:cs="Times New Roman"/>
+          <w:color w:val="BBBEBF"/>
+          <w:kern w:val="0"/>
+          <w:sz w:val="21"/>
+          <w:szCs w:val="21"/>
+          <w14:ligatures w14:val="none"/>
+        </w:rPr>
+      </w:pPr>
+      <w:r>
+        <w:rPr>
+          <w:rFonts w:ascii="Consolas" w:eastAsia="Times New Roman" w:hAnsi="Consolas" w:cs="Times New Roman"/>
+          <w:color w:val="BBBEBF"/>
+          <w:kern w:val="0"/>
+          <w:sz w:val="21"/>
+          <w:szCs w:val="21"/>
+          <w14:ligatures w14:val="none"/>
+        </w:rPr>
+        <w:t>    if data["seasonID"]:</w:t>
+      </w:r>
+    </w:p>
+    <w:p>
+      <w:pPr>
+        <w:shd w:val="clear" w:color="auto" w:fill="121314"/>
+        <w:spacing w:after="0" w:line="285" w:lineRule="atLeast"/>
+        <w:ind w:left="360"/>
+        <w:rPr>
+          <w:rFonts w:ascii="Consolas" w:eastAsia="Times New Roman" w:hAnsi="Consolas" w:cs="Times New Roman"/>
+          <w:color w:val="BBBEBF"/>
+          <w:kern w:val="0"/>
+          <w:sz w:val="21"/>
+          <w:szCs w:val="21"/>
+          <w14:ligatures w14:val="none"/>
+        </w:rPr>
+      </w:pPr>
+      <w:r>
+        <w:rPr>
+          <w:rFonts w:ascii="Consolas" w:eastAsia="Times New Roman" w:hAnsi="Consolas" w:cs="Times New Roman"/>
+          <w:color w:val="BBBEBF"/>
+          <w:kern w:val="0"/>
+          <w:sz w:val="21"/>
+          <w:szCs w:val="21"/>
+          <w14:ligatures w14:val="none"/>
+        </w:rPr>
+        <w:t>        placeholders = ",".join(["?" for _ in data["seasonID"]])</w:t>
+      </w:r>
+    </w:p>
+    <w:p>
+      <w:pPr>
+        <w:shd w:val="clear" w:color="auto" w:fill="121314"/>
+        <w:spacing w:after="0" w:line="285" w:lineRule="atLeast"/>
+        <w:ind w:left="360"/>
+        <w:rPr>
+          <w:rFonts w:ascii="Consolas" w:eastAsia="Times New Roman" w:hAnsi="Consolas" w:cs="Times New Roman"/>
+          <w:color w:val="BBBEBF"/>
+          <w:kern w:val="0"/>
+          <w:sz w:val="21"/>
+          <w:szCs w:val="21"/>
+          <w14:ligatures w14:val="none"/>
+        </w:rPr>
+      </w:pPr>
+      <w:r>
+        <w:rPr>
+          <w:rFonts w:ascii="Consolas" w:eastAsia="Times New Roman" w:hAnsi="Consolas" w:cs="Times New Roman"/>
+          <w:color w:val="BBBEBF"/>
+          <w:kern w:val="0"/>
+          <w:sz w:val="21"/>
+          <w:szCs w:val="21"/>
+          <w14:ligatures w14:val="none"/>
+        </w:rPr>
+        <w:t>        query += f" AND S.SeasonID IN ({placeholders})"</w:t>
+      </w:r>
+    </w:p>
+    <w:p>
+      <w:pPr>
+        <w:shd w:val="clear" w:color="auto" w:fill="121314"/>
+        <w:spacing w:after="0" w:line="285" w:lineRule="atLeast"/>
+        <w:ind w:left="360"/>
+        <w:rPr>
+          <w:rFonts w:ascii="Consolas" w:eastAsia="Times New Roman" w:hAnsi="Consolas" w:cs="Times New Roman"/>
+          <w:color w:val="BBBEBF"/>
+          <w:kern w:val="0"/>
+          <w:sz w:val="21"/>
+          <w:szCs w:val="21"/>
+          <w14:ligatures w14:val="none"/>
+        </w:rPr>
+      </w:pPr>
+      <w:r>
+        <w:rPr>
+          <w:rFonts w:ascii="Consolas" w:eastAsia="Times New Roman" w:hAnsi="Consolas" w:cs="Times New Roman"/>
+          <w:color w:val="BBBEBF"/>
+          <w:kern w:val="0"/>
+          <w:sz w:val="21"/>
+          <w:szCs w:val="21"/>
+          <w14:ligatures w14:val="none"/>
+        </w:rPr>
+        <w:t>        params.extend(data["seasonID"])</w:t>
+      </w:r>
+    </w:p>
+    <w:p>
+      <w:pPr>
+        <w:shd w:val="clear" w:color="auto" w:fill="121314"/>
+        <w:spacing w:after="0" w:line="285" w:lineRule="atLeast"/>
+        <w:ind w:left="360"/>
+        <w:rPr>
+          <w:rFonts w:ascii="Consolas" w:eastAsia="Times New Roman" w:hAnsi="Consolas" w:cs="Times New Roman"/>
+          <w:color w:val="BBBEBF"/>
+          <w:kern w:val="0"/>
+          <w:sz w:val="21"/>
+          <w:szCs w:val="21"/>
+          <w14:ligatures w14:val="none"/>
+        </w:rPr>
+      </w:pPr>
+    </w:p>
+    <w:p>
+      <w:pPr>
+        <w:shd w:val="clear" w:color="auto" w:fill="121314"/>
+        <w:spacing w:after="0" w:line="285" w:lineRule="atLeast"/>
+        <w:ind w:left="360"/>
+        <w:rPr>
+          <w:rFonts w:ascii="Consolas" w:eastAsia="Times New Roman" w:hAnsi="Consolas" w:cs="Times New Roman"/>
+          <w:color w:val="BBBEBF"/>
+          <w:kern w:val="0"/>
+          <w:sz w:val="21"/>
+          <w:szCs w:val="21"/>
+          <w14:ligatures w14:val="none"/>
+        </w:rPr>
+      </w:pPr>
+      <w:r>
+        <w:rPr>
+          <w:rFonts w:ascii="Consolas" w:eastAsia="Times New Roman" w:hAnsi="Consolas" w:cs="Times New Roman"/>
+          <w:color w:val="BBBEBF"/>
+          <w:kern w:val="0"/>
+          <w:sz w:val="21"/>
+          <w:szCs w:val="21"/>
+          <w14:ligatures w14:val="none"/>
+        </w:rPr>
+        <w:t>    query += " GROUP BY P.PlayerID, P.PlayerName, P.BirthDate, P.Position, TP.TeamPlayerID, S.SeasonID"</w:t>
+      </w:r>
+    </w:p>
+    <w:p>
+      <w:pPr>
+        <w:shd w:val="clear" w:color="auto" w:fill="121314"/>
+        <w:spacing w:after="0" w:line="285" w:lineRule="atLeast"/>
+        <w:ind w:left="360"/>
+        <w:rPr>
+          <w:rFonts w:ascii="Consolas" w:eastAsia="Times New Roman" w:hAnsi="Consolas" w:cs="Times New Roman"/>
+          <w:color w:val="BBBEBF"/>
+          <w:kern w:val="0"/>
+          <w:sz w:val="21"/>
+          <w:szCs w:val="21"/>
+          <w14:ligatures w14:val="none"/>
+        </w:rPr>
+      </w:pPr>
+      <w:r>
+        <w:rPr>
+          <w:rFonts w:ascii="Consolas" w:eastAsia="Times New Roman" w:hAnsi="Consolas" w:cs="Times New Roman"/>
+          <w:color w:val="BBBEBF"/>
+          <w:kern w:val="0"/>
+          <w:sz w:val="21"/>
+          <w:szCs w:val="21"/>
+          <w14:ligatures w14:val="none"/>
+        </w:rPr>
+        <w:t>    query += " ORDER BY TotalGoals DESC, TotalAssists DESC"</w:t>
+      </w:r>
+    </w:p>
+    <w:p>
+      <w:pPr>
+        <w:shd w:val="clear" w:color="auto" w:fill="121314"/>
+        <w:spacing w:after="0" w:line="285" w:lineRule="atLeast"/>
+        <w:ind w:left="360"/>
+        <w:rPr>
+          <w:rFonts w:ascii="Consolas" w:eastAsia="Times New Roman" w:hAnsi="Consolas" w:cs="Times New Roman"/>
+          <w:color w:val="BBBEBF"/>
+          <w:kern w:val="0"/>
+          <w:sz w:val="21"/>
+          <w:szCs w:val="21"/>
+          <w14:ligatures w14:val="none"/>
+        </w:rPr>
+      </w:pPr>
+      <w:r>
+        <w:rPr>
+          <w:rFonts w:ascii="Consolas" w:eastAsia="Times New Roman" w:hAnsi="Consolas" w:cs="Times New Roman"/>
+          <w:color w:val="BBBEBF"/>
+          <w:kern w:val="0"/>
+          <w:sz w:val="21"/>
+          <w:szCs w:val="21"/>
+          <w14:ligatures w14:val="none"/>
+        </w:rPr>
+        <w:t>    query += " OFFSET (20 * (? - 1)) ROWS FETCH NEXT 20 ROWS ONLY"</w:t>
+      </w:r>
+    </w:p>
+    <w:p>
+      <w:pPr>
+        <w:shd w:val="clear" w:color="auto" w:fill="121314"/>
+        <w:spacing w:after="0" w:line="285" w:lineRule="atLeast"/>
+        <w:ind w:left="360"/>
+        <w:rPr>
+          <w:rFonts w:ascii="Consolas" w:eastAsia="Times New Roman" w:hAnsi="Consolas" w:cs="Times New Roman"/>
+          <w:color w:val="BBBEBF"/>
+          <w:kern w:val="0"/>
+          <w:sz w:val="21"/>
+          <w:szCs w:val="21"/>
+          <w14:ligatures w14:val="none"/>
+        </w:rPr>
+      </w:pPr>
+      <w:r>
+        <w:rPr>
+          <w:rFonts w:ascii="Consolas" w:eastAsia="Times New Roman" w:hAnsi="Consolas" w:cs="Times New Roman"/>
+          <w:color w:val="BBBEBF"/>
+          <w:kern w:val="0"/>
+          <w:sz w:val="21"/>
+          <w:szCs w:val="21"/>
+          <w14:ligatures w14:val="none"/>
+        </w:rPr>
+        <w:t>    params.append(int(data['pageNumber']))</w:t>
+      </w:r>
+    </w:p>
+    <w:p>
+      <w:pPr>
+        <w:shd w:val="clear" w:color="auto" w:fill="121314"/>
+        <w:spacing w:after="0" w:line="285" w:lineRule="atLeast"/>
+        <w:ind w:left="360"/>
+        <w:rPr>
+          <w:rFonts w:ascii="Consolas" w:eastAsia="Times New Roman" w:hAnsi="Consolas" w:cs="Times New Roman"/>
+          <w:color w:val="BBBEBF"/>
+          <w:kern w:val="0"/>
+          <w:sz w:val="21"/>
+          <w:szCs w:val="21"/>
+          <w14:ligatures w14:val="none"/>
+        </w:rPr>
+      </w:pPr>
+    </w:p>
+    <w:p>
+      <w:pPr>
+        <w:pStyle w:val="ListParagraph"/>
+        <w:numPr>
+          <w:ilvl w:val="0"/>
+          <w:numId w:val="1"/>
+        </w:numPr>
+        <w:shd w:val="clear" w:color="auto" w:fill="121314"/>
+        <w:spacing w:after="0" w:line="285" w:lineRule="atLeast"/>
+        <w:rPr>
+          <w:rFonts w:ascii="Consolas" w:eastAsia="Times New Roman" w:hAnsi="Consolas" w:cs="Times New Roman"/>
+          <w:color w:val="BBBEBF"/>
+          <w:kern w:val="0"/>
+          <w:sz w:val="21"/>
+          <w:szCs w:val="21"/>
+          <w14:ligatures w14:val="none"/>
+        </w:rPr>
+      </w:pPr>
+      <w:r>
+        <w:rPr>
+          <w:rFonts w:ascii="Consolas" w:eastAsia="Times New Roman" w:hAnsi="Consolas" w:cs="Times New Roman"/>
+          <w:color w:val="A5D6FF"/>
+          <w:kern w:val="0"/>
+          <w:sz w:val="21"/>
+          <w:szCs w:val="21"/>
+          <w14:ligatures w14:val="none"/>
+        </w:rPr>
+        <w:t>SELECT T.TeamID, T.TeamName, S.SeasonName,</w:t>
+      </w:r>
+    </w:p>
+    <w:p>
+      <w:pPr>
+        <w:shd w:val="clear" w:color="auto" w:fill="121314"/>
+        <w:spacing w:after="0" w:line="285" w:lineRule="atLeast"/>
+        <w:ind w:left="360"/>
+        <w:rPr>
+          <w:rFonts w:ascii="Consolas" w:eastAsia="Times New Roman" w:hAnsi="Consolas" w:cs="Times New Roman"/>
+          <w:color w:val="BBBEBF"/>
+          <w:kern w:val="0"/>
+          <w:sz w:val="21"/>
+          <w:szCs w:val="21"/>
+          <w14:ligatures w14:val="none"/>
+        </w:rPr>
+      </w:pPr>
+      <w:r>
+        <w:rPr>
+          <w:rFonts w:ascii="Consolas" w:eastAsia="Times New Roman" w:hAnsi="Consolas" w:cs="Times New Roman"/>
+          <w:color w:val="A5D6FF"/>
+          <w:kern w:val="0"/>
+          <w:sz w:val="21"/>
+          <w:szCs w:val="21"/>
+          <w14:ligatures w14:val="none"/>
+        </w:rPr>
+        <w:t>                COALESCE(SUM(PM.RedCards), 0)    AS TotalTeamRedCards,</w:t>
+      </w:r>
+    </w:p>
+    <w:p>
+      <w:pPr>
+        <w:shd w:val="clear" w:color="auto" w:fill="121314"/>
+        <w:spacing w:after="0" w:line="285" w:lineRule="atLeast"/>
+        <w:ind w:left="360"/>
+        <w:rPr>
+          <w:rFonts w:ascii="Consolas" w:eastAsia="Times New Roman" w:hAnsi="Consolas" w:cs="Times New Roman"/>
+          <w:color w:val="BBBEBF"/>
+          <w:kern w:val="0"/>
+          <w:sz w:val="21"/>
+          <w:szCs w:val="21"/>
+          <w14:ligatures w14:val="none"/>
+        </w:rPr>
+      </w:pPr>
+      <w:r>
+        <w:rPr>
+          <w:rFonts w:ascii="Consolas" w:eastAsia="Times New Roman" w:hAnsi="Consolas" w:cs="Times New Roman"/>
+          <w:color w:val="A5D6FF"/>
+          <w:kern w:val="0"/>
+          <w:sz w:val="21"/>
+          <w:szCs w:val="21"/>
+          <w14:ligatures w14:val="none"/>
+        </w:rPr>
+        <w:t>                COALESCE(SUM(PM.YellowCards), 0) AS TotalTeamYellowCards,</w:t>
+      </w:r>
+    </w:p>
+    <w:p>
+      <w:pPr>
+        <w:shd w:val="clear" w:color="auto" w:fill="121314"/>
+        <w:spacing w:after="0" w:line="285" w:lineRule="atLeast"/>
+        <w:ind w:left="360"/>
+        <w:rPr>
+          <w:rFonts w:ascii="Consolas" w:eastAsia="Times New Roman" w:hAnsi="Consolas" w:cs="Times New Roman"/>
+          <w:color w:val="BBBEBF"/>
+          <w:kern w:val="0"/>
+          <w:sz w:val="21"/>
+          <w:szCs w:val="21"/>
+          <w14:ligatures w14:val="none"/>
+        </w:rPr>
+      </w:pPr>
+      <w:r>
+        <w:rPr>
+          <w:rFonts w:ascii="Consolas" w:eastAsia="Times New Roman" w:hAnsi="Consolas" w:cs="Times New Roman"/>
+          <w:color w:val="A5D6FF"/>
+          <w:kern w:val="0"/>
+          <w:sz w:val="21"/>
+          <w:szCs w:val="21"/>
+          <w14:ligatures w14:val="none"/>
+        </w:rPr>
+        <w:t>                COALESCE(SUM(PM.Goals), 0)       AS TotalTeamGoals,</w:t>
+      </w:r>
+    </w:p>
+    <w:p>
+      <w:pPr>
+        <w:shd w:val="clear" w:color="auto" w:fill="121314"/>
+        <w:spacing w:after="0" w:line="285" w:lineRule="atLeast"/>
+        <w:ind w:left="360"/>
+        <w:rPr>
+          <w:rFonts w:ascii="Consolas" w:eastAsia="Times New Roman" w:hAnsi="Consolas" w:cs="Times New Roman"/>
+          <w:color w:val="BBBEBF"/>
+          <w:kern w:val="0"/>
+          <w:sz w:val="21"/>
+          <w:szCs w:val="21"/>
+          <w14:ligatures w14:val="none"/>
+        </w:rPr>
+      </w:pPr>
+      <w:r>
+        <w:rPr>
+          <w:rFonts w:ascii="Consolas" w:eastAsia="Times New Roman" w:hAnsi="Consolas" w:cs="Times New Roman"/>
+          <w:color w:val="A5D6FF"/>
+          <w:kern w:val="0"/>
+          <w:sz w:val="21"/>
+          <w:szCs w:val="21"/>
+          <w14:ligatures w14:val="none"/>
+        </w:rPr>
+        <w:t>                COALESCE(SUM(PM.Assists), 0)     AS TotalTeamAssists</w:t>
+      </w:r>
+    </w:p>
+    <w:p>
+      <w:pPr>
+        <w:shd w:val="clear" w:color="auto" w:fill="121314"/>
+        <w:spacing w:after="0" w:line="285" w:lineRule="atLeast"/>
+        <w:ind w:left="360"/>
+        <w:rPr>
+          <w:rFonts w:ascii="Consolas" w:eastAsia="Times New Roman" w:hAnsi="Consolas" w:cs="Times New Roman"/>
+          <w:color w:val="BBBEBF"/>
+          <w:kern w:val="0"/>
+          <w:sz w:val="21"/>
+          <w:szCs w:val="21"/>
+          <w14:ligatures w14:val="none"/>
+        </w:rPr>
+      </w:pPr>
+      <w:r>
+        <w:rPr>
+          <w:rFonts w:ascii="Consolas" w:eastAsia="Times New Roman" w:hAnsi="Consolas" w:cs="Times New Roman"/>
+          <w:color w:val="A5D6FF"/>
+          <w:kern w:val="0"/>
+          <w:sz w:val="21"/>
+          <w:szCs w:val="21"/>
+          <w14:ligatures w14:val="none"/>
+        </w:rPr>
+        <w:t>           FROM FantasyFootball.Team T</w:t>
+      </w:r>
+    </w:p>
+    <w:p>
+      <w:pPr>
+        <w:shd w:val="clear" w:color="auto" w:fill="121314"/>
+        <w:spacing w:after="0" w:line="285" w:lineRule="atLeast"/>
+        <w:ind w:left="360"/>
+        <w:rPr>
+          <w:rFonts w:ascii="Consolas" w:eastAsia="Times New Roman" w:hAnsi="Consolas" w:cs="Times New Roman"/>
+          <w:color w:val="BBBEBF"/>
+          <w:kern w:val="0"/>
+          <w:sz w:val="21"/>
+          <w:szCs w:val="21"/>
+          <w14:ligatures w14:val="none"/>
+        </w:rPr>
+      </w:pPr>
+      <w:r>
+        <w:rPr>
+          <w:rFonts w:ascii="Consolas" w:eastAsia="Times New Roman" w:hAnsi="Consolas" w:cs="Times New Roman"/>
+          <w:color w:val="A5D6FF"/>
+          <w:kern w:val="0"/>
+          <w:sz w:val="21"/>
+          <w:szCs w:val="21"/>
+          <w14:ligatures w14:val="none"/>
+        </w:rPr>
+        <w:t>           INNER JOIN FantasyFootball.TeamSeason TS ON TS.TeamID = T.TeamID</w:t>
+      </w:r>
+    </w:p>
+    <w:p>
+      <w:pPr>
+        <w:shd w:val="clear" w:color="auto" w:fill="121314"/>
+        <w:spacing w:after="0" w:line="285" w:lineRule="atLeast"/>
+        <w:ind w:left="360"/>
+        <w:rPr>
+          <w:rFonts w:ascii="Consolas" w:eastAsia="Times New Roman" w:hAnsi="Consolas" w:cs="Times New Roman"/>
+          <w:color w:val="BBBEBF"/>
+          <w:kern w:val="0"/>
+          <w:sz w:val="21"/>
+          <w:szCs w:val="21"/>
+          <w14:ligatures w14:val="none"/>
+        </w:rPr>
+      </w:pPr>
+      <w:r>
+        <w:rPr>
+          <w:rFonts w:ascii="Consolas" w:eastAsia="Times New Roman" w:hAnsi="Consolas" w:cs="Times New Roman"/>
+          <w:color w:val="A5D6FF"/>
+          <w:kern w:val="0"/>
+          <w:sz w:val="21"/>
+          <w:szCs w:val="21"/>
+          <w14:ligatures w14:val="none"/>
+        </w:rPr>
+        <w:lastRenderedPageBreak/>
+        <w:t>           INNER JOIN FantasyFootball.Season S ON S.SeasonID = TS.SeasonID</w:t>
+      </w:r>
+    </w:p>
+    <w:p>
+      <w:pPr>
+        <w:shd w:val="clear" w:color="auto" w:fill="121314"/>
+        <w:spacing w:after="0" w:line="285" w:lineRule="atLeast"/>
+        <w:ind w:left="360"/>
+        <w:rPr>
+          <w:rFonts w:ascii="Consolas" w:eastAsia="Times New Roman" w:hAnsi="Consolas" w:cs="Times New Roman"/>
+          <w:color w:val="BBBEBF"/>
+          <w:kern w:val="0"/>
+          <w:sz w:val="21"/>
+          <w:szCs w:val="21"/>
+          <w14:ligatures w14:val="none"/>
+        </w:rPr>
+      </w:pPr>
+      <w:r>
+        <w:rPr>
+          <w:rFonts w:ascii="Consolas" w:eastAsia="Times New Roman" w:hAnsi="Consolas" w:cs="Times New Roman"/>
+          <w:color w:val="A5D6FF"/>
+          <w:kern w:val="0"/>
+          <w:sz w:val="21"/>
+          <w:szCs w:val="21"/>
+          <w14:ligatures w14:val="none"/>
+        </w:rPr>
+        <w:t>           LEFT JOIN FantasyFootball.PlayerMatch PM ON PM.TeamSeasonID = TS.TeamSeasonID</w:t>
+      </w:r>
+    </w:p>
+    <w:p>
+      <w:pPr>
+        <w:shd w:val="clear" w:color="auto" w:fill="121314"/>
+        <w:spacing w:after="0" w:line="285" w:lineRule="atLeast"/>
+        <w:ind w:left="360"/>
+        <w:rPr>
+          <w:rFonts w:ascii="Consolas" w:eastAsia="Times New Roman" w:hAnsi="Consolas" w:cs="Times New Roman"/>
+          <w:color w:val="BBBEBF"/>
+          <w:kern w:val="0"/>
+          <w:sz w:val="21"/>
+          <w:szCs w:val="21"/>
+          <w14:ligatures w14:val="none"/>
+        </w:rPr>
+      </w:pPr>
+      <w:r>
+        <w:rPr>
+          <w:rFonts w:ascii="Consolas" w:eastAsia="Times New Roman" w:hAnsi="Consolas" w:cs="Times New Roman"/>
+          <w:color w:val="A5D6FF"/>
+          <w:kern w:val="0"/>
+          <w:sz w:val="21"/>
+          <w:szCs w:val="21"/>
+          <w14:ligatures w14:val="none"/>
+        </w:rPr>
+        <w:t>           WHERE S.SeasonID = ?</w:t>
+      </w:r>
+    </w:p>
+    <w:p>
+      <w:pPr>
+        <w:shd w:val="clear" w:color="auto" w:fill="121314"/>
+        <w:spacing w:after="0" w:line="285" w:lineRule="atLeast"/>
+        <w:ind w:left="360"/>
+        <w:rPr>
+          <w:rFonts w:ascii="Consolas" w:eastAsia="Times New Roman" w:hAnsi="Consolas" w:cs="Times New Roman"/>
+          <w:color w:val="BBBEBF"/>
+          <w:kern w:val="0"/>
+          <w:sz w:val="21"/>
+          <w:szCs w:val="21"/>
+          <w14:ligatures w14:val="none"/>
+        </w:rPr>
+      </w:pPr>
+      <w:r>
+        <w:rPr>
+          <w:rFonts w:ascii="Consolas" w:eastAsia="Times New Roman" w:hAnsi="Consolas" w:cs="Times New Roman"/>
+          <w:color w:val="A5D6FF"/>
+          <w:kern w:val="0"/>
+          <w:sz w:val="21"/>
+          <w:szCs w:val="21"/>
+          <w14:ligatures w14:val="none"/>
+        </w:rPr>
+        <w:t>           GROUP BY T.TeamID, T.TeamName, S.SeasonName</w:t>
+      </w:r>
+    </w:p>
+    <w:p>
+      <w:pPr>
+        <w:shd w:val="clear" w:color="auto" w:fill="121314"/>
+        <w:spacing w:after="0" w:line="285" w:lineRule="atLeast"/>
+        <w:ind w:left="360"/>
+        <w:rPr>
+          <w:rFonts w:ascii="Consolas" w:eastAsia="Times New Roman" w:hAnsi="Consolas" w:cs="Times New Roman"/>
+          <w:color w:val="BBBEBF"/>
+          <w:kern w:val="0"/>
+          <w:sz w:val="21"/>
+          <w:szCs w:val="21"/>
+          <w14:ligatures w14:val="none"/>
+        </w:rPr>
+      </w:pPr>
+      <w:r>
+        <w:rPr>
+          <w:rFonts w:ascii="Consolas" w:eastAsia="Times New Roman" w:hAnsi="Consolas" w:cs="Times New Roman"/>
+          <w:color w:val="A5D6FF"/>
+          <w:kern w:val="0"/>
+          <w:sz w:val="21"/>
+          <w:szCs w:val="21"/>
+          <w14:ligatures w14:val="none"/>
+        </w:rPr>
+        <w:t>           ORDER BY T.TeamName ASC</w:t>
+      </w:r>
+    </w:p>
+    <w:p>
+      <w:pPr>
+        <w:pStyle w:val="ListParagraph"/>
+        <w:numPr>
+          <w:ilvl w:val="0"/>
+          <w:numId w:val="1"/>
+        </w:numPr>
+        <w:shd w:val="clear" w:color="auto" w:fill="121314"/>
+        <w:spacing w:after="0" w:line="285" w:lineRule="atLeast"/>
+        <w:rPr>
+          <w:rFonts w:ascii="Consolas" w:eastAsia="Times New Roman" w:hAnsi="Consolas" w:cs="Times New Roman"/>
+          <w:color w:val="BBBEBF"/>
+          <w:kern w:val="0"/>
+          <w:sz w:val="21"/>
+          <w:szCs w:val="21"/>
+          <w14:ligatures w14:val="none"/>
+        </w:rPr>
+      </w:pPr>
+      <w:r>
+        <w:rPr>
+          <w:rFonts w:ascii="Consolas" w:eastAsia="Times New Roman" w:hAnsi="Consolas" w:cs="Times New Roman"/>
+          <w:color w:val="A5D6FF"/>
+          <w:kern w:val="0"/>
+          <w:sz w:val="21"/>
+          <w:szCs w:val="21"/>
+          <w14:ligatures w14:val="none"/>
+        </w:rPr>
+        <w:t>SELECT T.TeamName,</w:t>
+      </w:r>
+    </w:p>
+    <w:p>
+      <w:pPr>
+        <w:shd w:val="clear" w:color="auto" w:fill="121314"/>
+        <w:spacing w:after="0" w:line="285" w:lineRule="atLeast"/>
+        <w:ind w:left="360"/>
+        <w:rPr>
+          <w:rFonts w:ascii="Consolas" w:eastAsia="Times New Roman" w:hAnsi="Consolas" w:cs="Times New Roman"/>
+          <w:color w:val="BBBEBF"/>
+          <w:kern w:val="0"/>
+          <w:sz w:val="21"/>
+          <w:szCs w:val="21"/>
+          <w14:ligatures w14:val="none"/>
+        </w:rPr>
+      </w:pPr>
+      <w:r>
+        <w:rPr>
+          <w:rFonts w:ascii="Consolas" w:eastAsia="Times New Roman" w:hAnsi="Consolas" w:cs="Times New Roman"/>
+          <w:color w:val="A5D6FF"/>
+          <w:kern w:val="0"/>
+          <w:sz w:val="21"/>
+          <w:szCs w:val="21"/>
+          <w14:ligatures w14:val="none"/>
+        </w:rPr>
+        <w:t>               SUM(IIF(MT.Winner = N'Winner', 1, 0)) AS Wins,</w:t>
+      </w:r>
+    </w:p>
+    <w:p>
+      <w:pPr>
+        <w:shd w:val="clear" w:color="auto" w:fill="121314"/>
+        <w:spacing w:after="0" w:line="285" w:lineRule="atLeast"/>
+        <w:ind w:left="360"/>
+        <w:rPr>
+          <w:rFonts w:ascii="Consolas" w:eastAsia="Times New Roman" w:hAnsi="Consolas" w:cs="Times New Roman"/>
+          <w:color w:val="BBBEBF"/>
+          <w:kern w:val="0"/>
+          <w:sz w:val="21"/>
+          <w:szCs w:val="21"/>
+          <w14:ligatures w14:val="none"/>
+        </w:rPr>
+      </w:pPr>
+      <w:r>
+        <w:rPr>
+          <w:rFonts w:ascii="Consolas" w:eastAsia="Times New Roman" w:hAnsi="Consolas" w:cs="Times New Roman"/>
+          <w:color w:val="A5D6FF"/>
+          <w:kern w:val="0"/>
+          <w:sz w:val="21"/>
+          <w:szCs w:val="21"/>
+          <w14:ligatures w14:val="none"/>
+        </w:rPr>
+        <w:t>               SUM(IIF(MT.Winner = N'Loser',  1, 0)) AS Losses,</w:t>
+      </w:r>
+    </w:p>
+    <w:p>
+      <w:pPr>
+        <w:shd w:val="clear" w:color="auto" w:fill="121314"/>
+        <w:spacing w:after="0" w:line="285" w:lineRule="atLeast"/>
+        <w:ind w:left="360"/>
+        <w:rPr>
+          <w:rFonts w:ascii="Consolas" w:eastAsia="Times New Roman" w:hAnsi="Consolas" w:cs="Times New Roman"/>
+          <w:color w:val="BBBEBF"/>
+          <w:kern w:val="0"/>
+          <w:sz w:val="21"/>
+          <w:szCs w:val="21"/>
+          <w14:ligatures w14:val="none"/>
+        </w:rPr>
+      </w:pPr>
+      <w:r>
+        <w:rPr>
+          <w:rFonts w:ascii="Consolas" w:eastAsia="Times New Roman" w:hAnsi="Consolas" w:cs="Times New Roman"/>
+          <w:color w:val="A5D6FF"/>
+          <w:kern w:val="0"/>
+          <w:sz w:val="21"/>
+          <w:szCs w:val="21"/>
+          <w14:ligatures w14:val="none"/>
+        </w:rPr>
+        <w:t>               SUM(IIF(MT.Winner = N'Draw',   1, 0)) AS Draws</w:t>
+      </w:r>
+    </w:p>
+    <w:p>
+      <w:pPr>
+        <w:shd w:val="clear" w:color="auto" w:fill="121314"/>
+        <w:spacing w:after="0" w:line="285" w:lineRule="atLeast"/>
+        <w:ind w:left="360"/>
+        <w:rPr>
+          <w:rFonts w:ascii="Consolas" w:eastAsia="Times New Roman" w:hAnsi="Consolas" w:cs="Times New Roman"/>
+          <w:color w:val="BBBEBF"/>
+          <w:kern w:val="0"/>
+          <w:sz w:val="21"/>
+          <w:szCs w:val="21"/>
+          <w14:ligatures w14:val="none"/>
+        </w:rPr>
+      </w:pPr>
+      <w:r>
+        <w:rPr>
+          <w:rFonts w:ascii="Consolas" w:eastAsia="Times New Roman" w:hAnsi="Consolas" w:cs="Times New Roman"/>
+          <w:color w:val="A5D6FF"/>
+          <w:kern w:val="0"/>
+          <w:sz w:val="21"/>
+          <w:szCs w:val="21"/>
+          <w14:ligatures w14:val="none"/>
+        </w:rPr>
+        <w:t>           FROM FantasyFootball.Team T</w:t>
+      </w:r>
+    </w:p>
+    <w:p>
+      <w:pPr>
+        <w:shd w:val="clear" w:color="auto" w:fill="121314"/>
+        <w:spacing w:after="0" w:line="285" w:lineRule="atLeast"/>
+        <w:ind w:left="360"/>
+        <w:rPr>
+          <w:rFonts w:ascii="Consolas" w:eastAsia="Times New Roman" w:hAnsi="Consolas" w:cs="Times New Roman"/>
+          <w:color w:val="BBBEBF"/>
+          <w:kern w:val="0"/>
+          <w:sz w:val="21"/>
+          <w:szCs w:val="21"/>
+          <w14:ligatures w14:val="none"/>
+        </w:rPr>
+      </w:pPr>
+      <w:r>
+        <w:rPr>
+          <w:rFonts w:ascii="Consolas" w:eastAsia="Times New Roman" w:hAnsi="Consolas" w:cs="Times New Roman"/>
+          <w:color w:val="A5D6FF"/>
+          <w:kern w:val="0"/>
+          <w:sz w:val="21"/>
+          <w:szCs w:val="21"/>
+          <w14:ligatures w14:val="none"/>
+        </w:rPr>
+        <w:t>           INNER JOIN FantasyFootball.TeamSeason TS ON TS.TeamID = T.TeamID</w:t>
+      </w:r>
+    </w:p>
+    <w:p>
+      <w:pPr>
+        <w:shd w:val="clear" w:color="auto" w:fill="121314"/>
+        <w:spacing w:after="0" w:line="285" w:lineRule="atLeast"/>
+        <w:ind w:left="360"/>
+        <w:rPr>
+          <w:rFonts w:ascii="Consolas" w:eastAsia="Times New Roman" w:hAnsi="Consolas" w:cs="Times New Roman"/>
+          <w:color w:val="BBBEBF"/>
+          <w:kern w:val="0"/>
+          <w:sz w:val="21"/>
+          <w:szCs w:val="21"/>
+          <w14:ligatures w14:val="none"/>
+        </w:rPr>
+      </w:pPr>
+      <w:r>
+        <w:rPr>
+          <w:rFonts w:ascii="Consolas" w:eastAsia="Times New Roman" w:hAnsi="Consolas" w:cs="Times New Roman"/>
+          <w:color w:val="A5D6FF"/>
+          <w:kern w:val="0"/>
+          <w:sz w:val="21"/>
+          <w:szCs w:val="21"/>
+          <w14:ligatures w14:val="none"/>
+        </w:rPr>
+        <w:t>           INNER JOIN FantasyFootball.MatchTeam MT ON MT.TeamSeasonID = TS.TeamSeasonID</w:t>
+      </w:r>
+    </w:p>
+    <w:p>
+      <w:pPr>
+        <w:shd w:val="clear" w:color="auto" w:fill="121314"/>
+        <w:spacing w:after="0" w:line="285" w:lineRule="atLeast"/>
+        <w:ind w:left="360"/>
+        <w:rPr>
+          <w:rFonts w:ascii="Consolas" w:eastAsia="Times New Roman" w:hAnsi="Consolas" w:cs="Times New Roman"/>
+          <w:color w:val="BBBEBF"/>
+          <w:kern w:val="0"/>
+          <w:sz w:val="21"/>
+          <w:szCs w:val="21"/>
+          <w14:ligatures w14:val="none"/>
+        </w:rPr>
+      </w:pPr>
+      <w:r>
+        <w:rPr>
+          <w:rFonts w:ascii="Consolas" w:eastAsia="Times New Roman" w:hAnsi="Consolas" w:cs="Times New Roman"/>
+          <w:color w:val="A5D6FF"/>
+          <w:kern w:val="0"/>
+          <w:sz w:val="21"/>
+          <w:szCs w:val="21"/>
+          <w14:ligatures w14:val="none"/>
+        </w:rPr>
+        <w:t>           INNER JOIN FantasyFootball.Season S ON S.SeasonID = TS.SeasonID</w:t>
+      </w:r>
+    </w:p>
+    <w:p>
+      <w:pPr>
+        <w:shd w:val="clear" w:color="auto" w:fill="121314"/>
+        <w:spacing w:after="0" w:line="285" w:lineRule="atLeast"/>
+        <w:ind w:left="360"/>
+        <w:rPr>
+          <w:rFonts w:ascii="Consolas" w:eastAsia="Times New Roman" w:hAnsi="Consolas" w:cs="Times New Roman"/>
+          <w:color w:val="BBBEBF"/>
+          <w:kern w:val="0"/>
+          <w:sz w:val="21"/>
+          <w:szCs w:val="21"/>
+          <w14:ligatures w14:val="none"/>
+        </w:rPr>
+      </w:pPr>
+      <w:r>
+        <w:rPr>
+          <w:rFonts w:ascii="Consolas" w:eastAsia="Times New Roman" w:hAnsi="Consolas" w:cs="Times New Roman"/>
+          <w:color w:val="A5D6FF"/>
+          <w:kern w:val="0"/>
+          <w:sz w:val="21"/>
+          <w:szCs w:val="21"/>
+          <w14:ligatures w14:val="none"/>
+        </w:rPr>
+        <w:t>           WHERE S.SeasonID = ?</w:t>
+      </w:r>
+    </w:p>
+    <w:p>
+      <w:pPr>
+        <w:shd w:val="clear" w:color="auto" w:fill="121314"/>
+        <w:spacing w:after="0" w:line="285" w:lineRule="atLeast"/>
+        <w:ind w:left="360"/>
+        <w:rPr>
+          <w:rFonts w:ascii="Consolas" w:eastAsia="Times New Roman" w:hAnsi="Consolas" w:cs="Times New Roman"/>
+          <w:color w:val="BBBEBF"/>
+          <w:kern w:val="0"/>
+          <w:sz w:val="21"/>
+          <w:szCs w:val="21"/>
+          <w14:ligatures w14:val="none"/>
+        </w:rPr>
+      </w:pPr>
+      <w:r>
+        <w:rPr>
+          <w:rFonts w:ascii="Consolas" w:eastAsia="Times New Roman" w:hAnsi="Consolas" w:cs="Times New Roman"/>
+          <w:color w:val="A5D6FF"/>
+          <w:kern w:val="0"/>
+          <w:sz w:val="21"/>
+          <w:szCs w:val="21"/>
+          <w14:ligatures w14:val="none"/>
+        </w:rPr>
+        <w:t>           GROUP BY T.TeamName</w:t>
+      </w:r>
+    </w:p>
+    <w:p>
+      <w:pPr>
+        <w:shd w:val="clear" w:color="auto" w:fill="121314"/>
+        <w:spacing w:after="0" w:line="285" w:lineRule="atLeast"/>
+        <w:ind w:left="360"/>
+        <w:rPr>
+          <w:rFonts w:ascii="Consolas" w:eastAsia="Times New Roman" w:hAnsi="Consolas" w:cs="Times New Roman"/>
+          <w:color w:val="BBBEBF"/>
+          <w:kern w:val="0"/>
+          <w:sz w:val="21"/>
+          <w:szCs w:val="21"/>
+          <w14:ligatures w14:val="none"/>
+        </w:rPr>
+      </w:pPr>
+      <w:r>
+        <w:rPr>
+          <w:rFonts w:ascii="Consolas" w:eastAsia="Times New Roman" w:hAnsi="Consolas" w:cs="Times New Roman"/>
+          <w:color w:val="A5D6FF"/>
+          <w:kern w:val="0"/>
+          <w:sz w:val="21"/>
+          <w:szCs w:val="21"/>
+          <w14:ligatures w14:val="none"/>
+        </w:rPr>
+        <w:t>           ORDER BY Wins DESC</w:t>
+      </w:r>
+    </w:p>
+    <w:p>
+      <w:pPr>
+        <w:pStyle w:val="ListParagraph"/>
+        <w:numPr>
+          <w:ilvl w:val="0"/>
+          <w:numId w:val="1"/>
+        </w:numPr>
+        <w:shd w:val="clear" w:color="auto" w:fill="121314"/>
+        <w:spacing w:after="0" w:line="285" w:lineRule="atLeast"/>
+        <w:rPr>
+          <w:rFonts w:ascii="Consolas" w:eastAsia="Times New Roman" w:hAnsi="Consolas" w:cs="Times New Roman"/>
+          <w:color w:val="BBBEBF"/>
+          <w:kern w:val="0"/>
+          <w:sz w:val="21"/>
+          <w:szCs w:val="21"/>
+          <w14:ligatures w14:val="none"/>
+        </w:rPr>
+      </w:pPr>
+      <w:r>
+        <w:rPr>
+          <w:rFonts w:ascii="Consolas" w:eastAsia="Times New Roman" w:hAnsi="Consolas" w:cs="Times New Roman"/>
+          <w:color w:val="A5D6FF"/>
+          <w:kern w:val="0"/>
+          <w:sz w:val="21"/>
+          <w:szCs w:val="21"/>
+          <w14:ligatures w14:val="none"/>
+        </w:rPr>
+        <w:t>SELECT TOP 5</w:t>
+      </w:r>
+    </w:p>
+    <w:p>
+      <w:pPr>
+        <w:shd w:val="clear" w:color="auto" w:fill="121314"/>
+        <w:spacing w:after="0" w:line="285" w:lineRule="atLeast"/>
+        <w:ind w:left="360"/>
+        <w:rPr>
+          <w:rFonts w:ascii="Consolas" w:eastAsia="Times New Roman" w:hAnsi="Consolas" w:cs="Times New Roman"/>
+          <w:color w:val="BBBEBF"/>
+          <w:kern w:val="0"/>
+          <w:sz w:val="21"/>
+          <w:szCs w:val="21"/>
+          <w14:ligatures w14:val="none"/>
+        </w:rPr>
+      </w:pPr>
+      <w:r>
+        <w:rPr>
+          <w:rFonts w:ascii="Consolas" w:eastAsia="Times New Roman" w:hAnsi="Consolas" w:cs="Times New Roman"/>
+          <w:color w:val="A5D6FF"/>
+          <w:kern w:val="0"/>
+          <w:sz w:val="21"/>
+          <w:szCs w:val="21"/>
+          <w14:ligatures w14:val="none"/>
+        </w:rPr>
+        <w:t>                M.MatchID, M.MatchDate, M.MatchLocation,</w:t>
+      </w:r>
+    </w:p>
+    <w:p>
+      <w:pPr>
+        <w:shd w:val="clear" w:color="auto" w:fill="121314"/>
+        <w:spacing w:after="0" w:line="285" w:lineRule="atLeast"/>
+        <w:ind w:left="360"/>
+        <w:rPr>
+          <w:rFonts w:ascii="Consolas" w:eastAsia="Times New Roman" w:hAnsi="Consolas" w:cs="Times New Roman"/>
+          <w:color w:val="BBBEBF"/>
+          <w:kern w:val="0"/>
+          <w:sz w:val="21"/>
+          <w:szCs w:val="21"/>
+          <w14:ligatures w14:val="none"/>
+        </w:rPr>
+      </w:pPr>
+      <w:r>
+        <w:rPr>
+          <w:rFonts w:ascii="Consolas" w:eastAsia="Times New Roman" w:hAnsi="Consolas" w:cs="Times New Roman"/>
+          <w:color w:val="A5D6FF"/>
+          <w:kern w:val="0"/>
+          <w:sz w:val="21"/>
+          <w:szCs w:val="21"/>
+          <w14:ligatures w14:val="none"/>
+        </w:rPr>
+        <w:t>                HT.TeamName AS HomeTeam,</w:t>
+      </w:r>
+    </w:p>
+    <w:p>
+      <w:pPr>
+        <w:shd w:val="clear" w:color="auto" w:fill="121314"/>
+        <w:spacing w:after="0" w:line="285" w:lineRule="atLeast"/>
+        <w:ind w:left="360"/>
+        <w:rPr>
+          <w:rFonts w:ascii="Consolas" w:eastAsia="Times New Roman" w:hAnsi="Consolas" w:cs="Times New Roman"/>
+          <w:color w:val="BBBEBF"/>
+          <w:kern w:val="0"/>
+          <w:sz w:val="21"/>
+          <w:szCs w:val="21"/>
+          <w14:ligatures w14:val="none"/>
+        </w:rPr>
+      </w:pPr>
+      <w:r>
+        <w:rPr>
+          <w:rFonts w:ascii="Consolas" w:eastAsia="Times New Roman" w:hAnsi="Consolas" w:cs="Times New Roman"/>
+          <w:color w:val="A5D6FF"/>
+          <w:kern w:val="0"/>
+          <w:sz w:val="21"/>
+          <w:szCs w:val="21"/>
+          <w14:ligatures w14:val="none"/>
+        </w:rPr>
+        <w:t>                AT.TeamName AS AwayTeam,</w:t>
+      </w:r>
+    </w:p>
+    <w:p>
+      <w:pPr>
+        <w:shd w:val="clear" w:color="auto" w:fill="121314"/>
+        <w:spacing w:after="0" w:line="285" w:lineRule="atLeast"/>
+        <w:ind w:left="360"/>
+        <w:rPr>
+          <w:rFonts w:ascii="Consolas" w:eastAsia="Times New Roman" w:hAnsi="Consolas" w:cs="Times New Roman"/>
+          <w:color w:val="BBBEBF"/>
+          <w:kern w:val="0"/>
+          <w:sz w:val="21"/>
+          <w:szCs w:val="21"/>
+          <w14:ligatures w14:val="none"/>
+        </w:rPr>
+      </w:pPr>
+      <w:r>
+        <w:rPr>
+          <w:rFonts w:ascii="Consolas" w:eastAsia="Times New Roman" w:hAnsi="Consolas" w:cs="Times New Roman"/>
+          <w:color w:val="A5D6FF"/>
+          <w:kern w:val="0"/>
+          <w:sz w:val="21"/>
+          <w:szCs w:val="21"/>
+          <w14:ligatures w14:val="none"/>
+        </w:rPr>
+        <w:t>                COALESCE(HMP.Goals, 0) AS HomeGoals,</w:t>
+      </w:r>
+    </w:p>
+    <w:p>
+      <w:pPr>
+        <w:shd w:val="clear" w:color="auto" w:fill="121314"/>
+        <w:spacing w:after="0" w:line="285" w:lineRule="atLeast"/>
+        <w:ind w:left="360"/>
+        <w:rPr>
+          <w:rFonts w:ascii="Consolas" w:eastAsia="Times New Roman" w:hAnsi="Consolas" w:cs="Times New Roman"/>
+          <w:color w:val="BBBEBF"/>
+          <w:kern w:val="0"/>
+          <w:sz w:val="21"/>
+          <w:szCs w:val="21"/>
+          <w14:ligatures w14:val="none"/>
+        </w:rPr>
+      </w:pPr>
+      <w:r>
+        <w:rPr>
+          <w:rFonts w:ascii="Consolas" w:eastAsia="Times New Roman" w:hAnsi="Consolas" w:cs="Times New Roman"/>
+          <w:color w:val="A5D6FF"/>
+          <w:kern w:val="0"/>
+          <w:sz w:val="21"/>
+          <w:szCs w:val="21"/>
+          <w14:ligatures w14:val="none"/>
+        </w:rPr>
+        <w:t>                COALESCE(AMP.Goals, 0) AS AwayGoals,</w:t>
+      </w:r>
+    </w:p>
+    <w:p>
+      <w:pPr>
+        <w:shd w:val="clear" w:color="auto" w:fill="121314"/>
+        <w:spacing w:after="0" w:line="285" w:lineRule="atLeast"/>
+        <w:ind w:left="360"/>
+        <w:rPr>
+          <w:rFonts w:ascii="Consolas" w:eastAsia="Times New Roman" w:hAnsi="Consolas" w:cs="Times New Roman"/>
+          <w:color w:val="BBBEBF"/>
+          <w:kern w:val="0"/>
+          <w:sz w:val="21"/>
+          <w:szCs w:val="21"/>
+          <w14:ligatures w14:val="none"/>
+        </w:rPr>
+      </w:pPr>
+      <w:r>
+        <w:rPr>
+          <w:rFonts w:ascii="Consolas" w:eastAsia="Times New Roman" w:hAnsi="Consolas" w:cs="Times New Roman"/>
+          <w:color w:val="A5D6FF"/>
+          <w:kern w:val="0"/>
+          <w:sz w:val="21"/>
+          <w:szCs w:val="21"/>
+          <w14:ligatures w14:val="none"/>
+        </w:rPr>
+        <w:t>                CASE</w:t>
+      </w:r>
+    </w:p>
+    <w:p>
+      <w:pPr>
+        <w:shd w:val="clear" w:color="auto" w:fill="121314"/>
+        <w:spacing w:after="0" w:line="285" w:lineRule="atLeast"/>
+        <w:ind w:left="360"/>
+        <w:rPr>
+          <w:rFonts w:ascii="Consolas" w:eastAsia="Times New Roman" w:hAnsi="Consolas" w:cs="Times New Roman"/>
+          <w:color w:val="BBBEBF"/>
+          <w:kern w:val="0"/>
+          <w:sz w:val="21"/>
+          <w:szCs w:val="21"/>
+          <w14:ligatures w14:val="none"/>
+        </w:rPr>
+      </w:pPr>
+      <w:r>
+        <w:rPr>
+          <w:rFonts w:ascii="Consolas" w:eastAsia="Times New Roman" w:hAnsi="Consolas" w:cs="Times New Roman"/>
+          <w:color w:val="A5D6FF"/>
+          <w:kern w:val="0"/>
+          <w:sz w:val="21"/>
+          <w:szCs w:val="21"/>
+          <w14:ligatures w14:val="none"/>
+        </w:rPr>
+        <w:t>                    WHEN HMT.Winner = N'Draw' THEN 'Draw'</w:t>
+      </w:r>
+    </w:p>
+    <w:p>
+      <w:pPr>
+        <w:shd w:val="clear" w:color="auto" w:fill="121314"/>
+        <w:spacing w:after="0" w:line="285" w:lineRule="atLeast"/>
+        <w:ind w:left="360"/>
+        <w:rPr>
+          <w:rFonts w:ascii="Consolas" w:eastAsia="Times New Roman" w:hAnsi="Consolas" w:cs="Times New Roman"/>
+          <w:color w:val="BBBEBF"/>
+          <w:kern w:val="0"/>
+          <w:sz w:val="21"/>
+          <w:szCs w:val="21"/>
+          <w14:ligatures w14:val="none"/>
+        </w:rPr>
+      </w:pPr>
+      <w:r>
+        <w:rPr>
+          <w:rFonts w:ascii="Consolas" w:eastAsia="Times New Roman" w:hAnsi="Consolas" w:cs="Times New Roman"/>
+          <w:color w:val="A5D6FF"/>
+          <w:kern w:val="0"/>
+          <w:sz w:val="21"/>
+          <w:szCs w:val="21"/>
+          <w14:ligatures w14:val="none"/>
+        </w:rPr>
+        <w:t>                    WHEN HMT.TeamSeasonID = ? AND HMT.Winner = N'Winner' THEN HT.TeamName</w:t>
+      </w:r>
+    </w:p>
+    <w:p>
+      <w:pPr>
+        <w:shd w:val="clear" w:color="auto" w:fill="121314"/>
+        <w:spacing w:after="0" w:line="285" w:lineRule="atLeast"/>
+        <w:ind w:left="360"/>
+        <w:rPr>
+          <w:rFonts w:ascii="Consolas" w:eastAsia="Times New Roman" w:hAnsi="Consolas" w:cs="Times New Roman"/>
+          <w:color w:val="BBBEBF"/>
+          <w:kern w:val="0"/>
+          <w:sz w:val="21"/>
+          <w:szCs w:val="21"/>
+          <w14:ligatures w14:val="none"/>
+        </w:rPr>
+      </w:pPr>
+      <w:r>
+        <w:rPr>
+          <w:rFonts w:ascii="Consolas" w:eastAsia="Times New Roman" w:hAnsi="Consolas" w:cs="Times New Roman"/>
+          <w:color w:val="A5D6FF"/>
+          <w:kern w:val="0"/>
+          <w:sz w:val="21"/>
+          <w:szCs w:val="21"/>
+          <w14:ligatures w14:val="none"/>
+        </w:rPr>
+        <w:t>                    WHEN HMT.TeamSeasonID = ? AND HMT.Winner = N'Loser'  THEN AT.TeamName</w:t>
+      </w:r>
+    </w:p>
+    <w:p>
+      <w:pPr>
+        <w:shd w:val="clear" w:color="auto" w:fill="121314"/>
+        <w:spacing w:after="0" w:line="285" w:lineRule="atLeast"/>
+        <w:ind w:left="360"/>
+        <w:rPr>
+          <w:rFonts w:ascii="Consolas" w:eastAsia="Times New Roman" w:hAnsi="Consolas" w:cs="Times New Roman"/>
+          <w:color w:val="BBBEBF"/>
+          <w:kern w:val="0"/>
+          <w:sz w:val="21"/>
+          <w:szCs w:val="21"/>
+          <w14:ligatures w14:val="none"/>
+        </w:rPr>
+      </w:pPr>
+      <w:r>
+        <w:rPr>
+          <w:rFonts w:ascii="Consolas" w:eastAsia="Times New Roman" w:hAnsi="Consolas" w:cs="Times New Roman"/>
+          <w:color w:val="A5D6FF"/>
+          <w:kern w:val="0"/>
+          <w:sz w:val="21"/>
+          <w:szCs w:val="21"/>
+          <w14:ligatures w14:val="none"/>
+        </w:rPr>
+        <w:t>                    WHEN AMT.TeamSeasonID = ? AND AMT.Winner = N'Winner' THEN AT.TeamName</w:t>
+      </w:r>
+    </w:p>
+    <w:p>
+      <w:pPr>
+        <w:shd w:val="clear" w:color="auto" w:fill="121314"/>
+        <w:spacing w:after="0" w:line="285" w:lineRule="atLeast"/>
+        <w:ind w:left="360"/>
+        <w:rPr>
+          <w:rFonts w:ascii="Consolas" w:eastAsia="Times New Roman" w:hAnsi="Consolas" w:cs="Times New Roman"/>
+          <w:color w:val="BBBEBF"/>
+          <w:kern w:val="0"/>
+          <w:sz w:val="21"/>
+          <w:szCs w:val="21"/>
+          <w14:ligatures w14:val="none"/>
+        </w:rPr>
+      </w:pPr>
+      <w:r>
+        <w:rPr>
+          <w:rFonts w:ascii="Consolas" w:eastAsia="Times New Roman" w:hAnsi="Consolas" w:cs="Times New Roman"/>
+          <w:color w:val="A5D6FF"/>
+          <w:kern w:val="0"/>
+          <w:sz w:val="21"/>
+          <w:szCs w:val="21"/>
+          <w14:ligatures w14:val="none"/>
+        </w:rPr>
+        <w:t>                    WHEN AMT.TeamSeasonID = ? AND AMT.Winner = N'Loser'  THEN HT.TeamName</w:t>
+      </w:r>
+    </w:p>
+    <w:p>
+      <w:pPr>
+        <w:shd w:val="clear" w:color="auto" w:fill="121314"/>
+        <w:spacing w:after="0" w:line="285" w:lineRule="atLeast"/>
+        <w:ind w:left="360"/>
+        <w:rPr>
+          <w:rFonts w:ascii="Consolas" w:eastAsia="Times New Roman" w:hAnsi="Consolas" w:cs="Times New Roman"/>
+          <w:color w:val="BBBEBF"/>
+          <w:kern w:val="0"/>
+          <w:sz w:val="21"/>
+          <w:szCs w:val="21"/>
+          <w14:ligatures w14:val="none"/>
+        </w:rPr>
+      </w:pPr>
+      <w:r>
+        <w:rPr>
+          <w:rFonts w:ascii="Consolas" w:eastAsia="Times New Roman" w:hAnsi="Consolas" w:cs="Times New Roman"/>
+          <w:color w:val="A5D6FF"/>
+          <w:kern w:val="0"/>
+          <w:sz w:val="21"/>
+          <w:szCs w:val="21"/>
+          <w14:ligatures w14:val="none"/>
+        </w:rPr>
+        <w:t>                END AS Winner</w:t>
+      </w:r>
+    </w:p>
+    <w:p>
+      <w:pPr>
+        <w:shd w:val="clear" w:color="auto" w:fill="121314"/>
+        <w:spacing w:after="0" w:line="285" w:lineRule="atLeast"/>
+        <w:ind w:left="360"/>
+        <w:rPr>
+          <w:rFonts w:ascii="Consolas" w:eastAsia="Times New Roman" w:hAnsi="Consolas" w:cs="Times New Roman"/>
+          <w:color w:val="BBBEBF"/>
+          <w:kern w:val="0"/>
+          <w:sz w:val="21"/>
+          <w:szCs w:val="21"/>
+          <w14:ligatures w14:val="none"/>
+        </w:rPr>
+      </w:pPr>
+      <w:r>
+        <w:rPr>
+          <w:rFonts w:ascii="Consolas" w:eastAsia="Times New Roman" w:hAnsi="Consolas" w:cs="Times New Roman"/>
+          <w:color w:val="A5D6FF"/>
+          <w:kern w:val="0"/>
+          <w:sz w:val="21"/>
+          <w:szCs w:val="21"/>
+          <w14:ligatures w14:val="none"/>
+        </w:rPr>
+        <w:t>           FROM FantasyFootball.Match M</w:t>
+      </w:r>
+    </w:p>
+    <w:p>
+      <w:pPr>
+        <w:shd w:val="clear" w:color="auto" w:fill="121314"/>
+        <w:spacing w:after="0" w:line="285" w:lineRule="atLeast"/>
+        <w:ind w:left="360"/>
+        <w:rPr>
+          <w:rFonts w:ascii="Consolas" w:eastAsia="Times New Roman" w:hAnsi="Consolas" w:cs="Times New Roman"/>
+          <w:color w:val="BBBEBF"/>
+          <w:kern w:val="0"/>
+          <w:sz w:val="21"/>
+          <w:szCs w:val="21"/>
+          <w14:ligatures w14:val="none"/>
+        </w:rPr>
+      </w:pPr>
+      <w:r>
+        <w:rPr>
+          <w:rFonts w:ascii="Consolas" w:eastAsia="Times New Roman" w:hAnsi="Consolas" w:cs="Times New Roman"/>
+          <w:color w:val="A5D6FF"/>
+          <w:kern w:val="0"/>
+          <w:sz w:val="21"/>
+          <w:szCs w:val="21"/>
+          <w14:ligatures w14:val="none"/>
+        </w:rPr>
+        <w:t>           INNER JOIN FantasyFootball.MatchTeam HMT ON HMT.MatchID = M.MatchID AND HMT.TeamTypeID = 1</w:t>
+      </w:r>
+    </w:p>
+    <w:p>
+      <w:pPr>
+        <w:shd w:val="clear" w:color="auto" w:fill="121314"/>
+        <w:spacing w:after="0" w:line="285" w:lineRule="atLeast"/>
+        <w:ind w:left="360"/>
+        <w:rPr>
+          <w:rFonts w:ascii="Consolas" w:eastAsia="Times New Roman" w:hAnsi="Consolas" w:cs="Times New Roman"/>
+          <w:color w:val="BBBEBF"/>
+          <w:kern w:val="0"/>
+          <w:sz w:val="21"/>
+          <w:szCs w:val="21"/>
+          <w14:ligatures w14:val="none"/>
+        </w:rPr>
+      </w:pPr>
+      <w:r>
+        <w:rPr>
+          <w:rFonts w:ascii="Consolas" w:eastAsia="Times New Roman" w:hAnsi="Consolas" w:cs="Times New Roman"/>
+          <w:color w:val="A5D6FF"/>
+          <w:kern w:val="0"/>
+          <w:sz w:val="21"/>
+          <w:szCs w:val="21"/>
+          <w14:ligatures w14:val="none"/>
+        </w:rPr>
+        <w:t>           INNER JOIN FantasyFootball.TeamSeason HTS ON HTS.TeamSeasonID = HMT.TeamSeasonID</w:t>
+      </w:r>
+    </w:p>
+    <w:p>
+      <w:pPr>
+        <w:shd w:val="clear" w:color="auto" w:fill="121314"/>
+        <w:spacing w:after="0" w:line="285" w:lineRule="atLeast"/>
+        <w:ind w:left="360"/>
+        <w:rPr>
+          <w:rFonts w:ascii="Consolas" w:eastAsia="Times New Roman" w:hAnsi="Consolas" w:cs="Times New Roman"/>
+          <w:color w:val="BBBEBF"/>
+          <w:kern w:val="0"/>
+          <w:sz w:val="21"/>
+          <w:szCs w:val="21"/>
+          <w14:ligatures w14:val="none"/>
+        </w:rPr>
+      </w:pPr>
+      <w:r>
+        <w:rPr>
+          <w:rFonts w:ascii="Consolas" w:eastAsia="Times New Roman" w:hAnsi="Consolas" w:cs="Times New Roman"/>
+          <w:color w:val="A5D6FF"/>
+          <w:kern w:val="0"/>
+          <w:sz w:val="21"/>
+          <w:szCs w:val="21"/>
+          <w14:ligatures w14:val="none"/>
+        </w:rPr>
+        <w:t>           INNER JOIN FantasyFootball.Team HT ON HT.TeamID = HTS.TeamID</w:t>
+      </w:r>
+    </w:p>
+    <w:p>
+      <w:pPr>
+        <w:shd w:val="clear" w:color="auto" w:fill="121314"/>
+        <w:spacing w:after="0" w:line="285" w:lineRule="atLeast"/>
+        <w:ind w:left="360"/>
+        <w:rPr>
+          <w:rFonts w:ascii="Consolas" w:eastAsia="Times New Roman" w:hAnsi="Consolas" w:cs="Times New Roman"/>
+          <w:color w:val="BBBEBF"/>
+          <w:kern w:val="0"/>
+          <w:sz w:val="21"/>
+          <w:szCs w:val="21"/>
+          <w14:ligatures w14:val="none"/>
+        </w:rPr>
+      </w:pPr>
+      <w:r>
+        <w:rPr>
+          <w:rFonts w:ascii="Consolas" w:eastAsia="Times New Roman" w:hAnsi="Consolas" w:cs="Times New Roman"/>
+          <w:color w:val="A5D6FF"/>
+          <w:kern w:val="0"/>
+          <w:sz w:val="21"/>
+          <w:szCs w:val="21"/>
+          <w14:ligatures w14:val="none"/>
+        </w:rPr>
+        <w:t>           INNER JOIN FantasyFootball.MatchTeam AMT ON AMT.MatchID = M.MatchID AND AMT.TeamTypeID = 2</w:t>
+      </w:r>
+    </w:p>
+    <w:p>
+      <w:pPr>
+        <w:shd w:val="clear" w:color="auto" w:fill="121314"/>
+        <w:spacing w:after="0" w:line="285" w:lineRule="atLeast"/>
+        <w:ind w:left="360"/>
+        <w:rPr>
+          <w:rFonts w:ascii="Consolas" w:eastAsia="Times New Roman" w:hAnsi="Consolas" w:cs="Times New Roman"/>
+          <w:color w:val="BBBEBF"/>
+          <w:kern w:val="0"/>
+          <w:sz w:val="21"/>
+          <w:szCs w:val="21"/>
+          <w14:ligatures w14:val="none"/>
+        </w:rPr>
+      </w:pPr>
+      <w:r>
+        <w:rPr>
+          <w:rFonts w:ascii="Consolas" w:eastAsia="Times New Roman" w:hAnsi="Consolas" w:cs="Times New Roman"/>
+          <w:color w:val="A5D6FF"/>
+          <w:kern w:val="0"/>
+          <w:sz w:val="21"/>
+          <w:szCs w:val="21"/>
+          <w14:ligatures w14:val="none"/>
+        </w:rPr>
+        <w:t>           INNER JOIN FantasyFootball.TeamSeason ATS ON ATS.TeamSeasonID = AMT.TeamSeasonID</w:t>
+      </w:r>
+    </w:p>
+    <w:p>
+      <w:pPr>
+        <w:shd w:val="clear" w:color="auto" w:fill="121314"/>
+        <w:spacing w:after="0" w:line="285" w:lineRule="atLeast"/>
+        <w:ind w:left="360"/>
+        <w:rPr>
+          <w:rFonts w:ascii="Consolas" w:eastAsia="Times New Roman" w:hAnsi="Consolas" w:cs="Times New Roman"/>
+          <w:color w:val="BBBEBF"/>
+          <w:kern w:val="0"/>
+          <w:sz w:val="21"/>
+          <w:szCs w:val="21"/>
+          <w14:ligatures w14:val="none"/>
+        </w:rPr>
+      </w:pPr>
+      <w:r>
+        <w:rPr>
+          <w:rFonts w:ascii="Consolas" w:eastAsia="Times New Roman" w:hAnsi="Consolas" w:cs="Times New Roman"/>
+          <w:color w:val="A5D6FF"/>
+          <w:kern w:val="0"/>
+          <w:sz w:val="21"/>
+          <w:szCs w:val="21"/>
+          <w14:ligatures w14:val="none"/>
+        </w:rPr>
+        <w:lastRenderedPageBreak/>
+        <w:t>           INNER JOIN FantasyFootball.Team AT ON AT.TeamID = ATS.TeamID</w:t>
+      </w:r>
+    </w:p>
+    <w:p>
+      <w:pPr>
+        <w:shd w:val="clear" w:color="auto" w:fill="121314"/>
+        <w:spacing w:after="0" w:line="285" w:lineRule="atLeast"/>
+        <w:ind w:left="360"/>
+        <w:rPr>
+          <w:rFonts w:ascii="Consolas" w:eastAsia="Times New Roman" w:hAnsi="Consolas" w:cs="Times New Roman"/>
+          <w:color w:val="BBBEBF"/>
+          <w:kern w:val="0"/>
+          <w:sz w:val="21"/>
+          <w:szCs w:val="21"/>
+          <w14:ligatures w14:val="none"/>
+        </w:rPr>
+      </w:pPr>
+      <w:r>
+        <w:rPr>
+          <w:rFonts w:ascii="Consolas" w:eastAsia="Times New Roman" w:hAnsi="Consolas" w:cs="Times New Roman"/>
+          <w:color w:val="A5D6FF"/>
+          <w:kern w:val="0"/>
+          <w:sz w:val="21"/>
+          <w:szCs w:val="21"/>
+          <w14:ligatures w14:val="none"/>
+        </w:rPr>
+        <w:t>           LEFT JOIN (</w:t>
+      </w:r>
+    </w:p>
+    <w:p>
+      <w:pPr>
+        <w:shd w:val="clear" w:color="auto" w:fill="121314"/>
+        <w:spacing w:after="0" w:line="285" w:lineRule="atLeast"/>
+        <w:ind w:left="360"/>
+        <w:rPr>
+          <w:rFonts w:ascii="Consolas" w:eastAsia="Times New Roman" w:hAnsi="Consolas" w:cs="Times New Roman"/>
+          <w:color w:val="BBBEBF"/>
+          <w:kern w:val="0"/>
+          <w:sz w:val="21"/>
+          <w:szCs w:val="21"/>
+          <w14:ligatures w14:val="none"/>
+        </w:rPr>
+      </w:pPr>
+      <w:r>
+        <w:rPr>
+          <w:rFonts w:ascii="Consolas" w:eastAsia="Times New Roman" w:hAnsi="Consolas" w:cs="Times New Roman"/>
+          <w:color w:val="A5D6FF"/>
+          <w:kern w:val="0"/>
+          <w:sz w:val="21"/>
+          <w:szCs w:val="21"/>
+          <w14:ligatures w14:val="none"/>
+        </w:rPr>
+        <w:t>                SELECT PM.MatchID, PM.TeamSeasonID, SUM(PM.Goals) AS Goals</w:t>
+      </w:r>
+    </w:p>
+    <w:p>
+      <w:pPr>
+        <w:shd w:val="clear" w:color="auto" w:fill="121314"/>
+        <w:spacing w:after="0" w:line="285" w:lineRule="atLeast"/>
+        <w:ind w:left="360"/>
+        <w:rPr>
+          <w:rFonts w:ascii="Consolas" w:eastAsia="Times New Roman" w:hAnsi="Consolas" w:cs="Times New Roman"/>
+          <w:color w:val="BBBEBF"/>
+          <w:kern w:val="0"/>
+          <w:sz w:val="21"/>
+          <w:szCs w:val="21"/>
+          <w14:ligatures w14:val="none"/>
+        </w:rPr>
+      </w:pPr>
+      <w:r>
+        <w:rPr>
+          <w:rFonts w:ascii="Consolas" w:eastAsia="Times New Roman" w:hAnsi="Consolas" w:cs="Times New Roman"/>
+          <w:color w:val="A5D6FF"/>
+          <w:kern w:val="0"/>
+          <w:sz w:val="21"/>
+          <w:szCs w:val="21"/>
+          <w14:ligatures w14:val="none"/>
+        </w:rPr>
+        <w:t>                FROM FantasyFootball.PlayerMatch PM</w:t>
+      </w:r>
+    </w:p>
+    <w:p>
+      <w:pPr>
+        <w:shd w:val="clear" w:color="auto" w:fill="121314"/>
+        <w:spacing w:after="0" w:line="285" w:lineRule="atLeast"/>
+        <w:ind w:left="360"/>
+        <w:rPr>
+          <w:rFonts w:ascii="Consolas" w:eastAsia="Times New Roman" w:hAnsi="Consolas" w:cs="Times New Roman"/>
+          <w:color w:val="BBBEBF"/>
+          <w:kern w:val="0"/>
+          <w:sz w:val="21"/>
+          <w:szCs w:val="21"/>
+          <w14:ligatures w14:val="none"/>
+        </w:rPr>
+      </w:pPr>
+      <w:r>
+        <w:rPr>
+          <w:rFonts w:ascii="Consolas" w:eastAsia="Times New Roman" w:hAnsi="Consolas" w:cs="Times New Roman"/>
+          <w:color w:val="A5D6FF"/>
+          <w:kern w:val="0"/>
+          <w:sz w:val="21"/>
+          <w:szCs w:val="21"/>
+          <w14:ligatures w14:val="none"/>
+        </w:rPr>
+        <w:t>                GROUP BY PM.MatchID, PM.TeamSeasonID</w:t>
+      </w:r>
+    </w:p>
+    <w:p>
+      <w:pPr>
+        <w:shd w:val="clear" w:color="auto" w:fill="121314"/>
+        <w:spacing w:after="0" w:line="285" w:lineRule="atLeast"/>
+        <w:ind w:left="360"/>
+        <w:rPr>
+          <w:rFonts w:ascii="Consolas" w:eastAsia="Times New Roman" w:hAnsi="Consolas" w:cs="Times New Roman"/>
+          <w:color w:val="BBBEBF"/>
+          <w:kern w:val="0"/>
+          <w:sz w:val="21"/>
+          <w:szCs w:val="21"/>
+          <w14:ligatures w14:val="none"/>
+        </w:rPr>
+      </w:pPr>
+      <w:r>
+        <w:rPr>
+          <w:rFonts w:ascii="Consolas" w:eastAsia="Times New Roman" w:hAnsi="Consolas" w:cs="Times New Roman"/>
+          <w:color w:val="A5D6FF"/>
+          <w:kern w:val="0"/>
+          <w:sz w:val="21"/>
+          <w:szCs w:val="21"/>
+          <w14:ligatures w14:val="none"/>
+        </w:rPr>
+        <w:t>           ) HMP ON HMP.MatchID = M.MatchID AND HMP.TeamSeasonID = HMT.TeamSeasonID</w:t>
+      </w:r>
+    </w:p>
+    <w:p>
+      <w:pPr>
+        <w:shd w:val="clear" w:color="auto" w:fill="121314"/>
+        <w:spacing w:after="0" w:line="285" w:lineRule="atLeast"/>
+        <w:ind w:left="360"/>
+        <w:rPr>
+          <w:rFonts w:ascii="Consolas" w:eastAsia="Times New Roman" w:hAnsi="Consolas" w:cs="Times New Roman"/>
+          <w:color w:val="BBBEBF"/>
+          <w:kern w:val="0"/>
+          <w:sz w:val="21"/>
+          <w:szCs w:val="21"/>
+          <w14:ligatures w14:val="none"/>
+        </w:rPr>
+      </w:pPr>
+      <w:r>
+        <w:rPr>
+          <w:rFonts w:ascii="Consolas" w:eastAsia="Times New Roman" w:hAnsi="Consolas" w:cs="Times New Roman"/>
+          <w:color w:val="A5D6FF"/>
+          <w:kern w:val="0"/>
+          <w:sz w:val="21"/>
+          <w:szCs w:val="21"/>
+          <w14:ligatures w14:val="none"/>
+        </w:rPr>
+        <w:t>           LEFT JOIN (</w:t>
+      </w:r>
+    </w:p>
+    <w:p>
+      <w:pPr>
+        <w:shd w:val="clear" w:color="auto" w:fill="121314"/>
+        <w:spacing w:after="0" w:line="285" w:lineRule="atLeast"/>
+        <w:ind w:left="360"/>
+        <w:rPr>
+          <w:rFonts w:ascii="Consolas" w:eastAsia="Times New Roman" w:hAnsi="Consolas" w:cs="Times New Roman"/>
+          <w:color w:val="BBBEBF"/>
+          <w:kern w:val="0"/>
+          <w:sz w:val="21"/>
+          <w:szCs w:val="21"/>
+          <w14:ligatures w14:val="none"/>
+        </w:rPr>
+      </w:pPr>
+      <w:r>
+        <w:rPr>
+          <w:rFonts w:ascii="Consolas" w:eastAsia="Times New Roman" w:hAnsi="Consolas" w:cs="Times New Roman"/>
+          <w:color w:val="A5D6FF"/>
+          <w:kern w:val="0"/>
+          <w:sz w:val="21"/>
+          <w:szCs w:val="21"/>
+          <w14:ligatures w14:val="none"/>
+        </w:rPr>
+        <w:t>                SELECT PM.MatchID, PM.TeamSeasonID, SUM(PM.Goals) AS Goals</w:t>
+      </w:r>
+    </w:p>
+    <w:p>
+      <w:pPr>
+        <w:shd w:val="clear" w:color="auto" w:fill="121314"/>
+        <w:spacing w:after="0" w:line="285" w:lineRule="atLeast"/>
+        <w:ind w:left="360"/>
+        <w:rPr>
+          <w:rFonts w:ascii="Consolas" w:eastAsia="Times New Roman" w:hAnsi="Consolas" w:cs="Times New Roman"/>
+          <w:color w:val="BBBEBF"/>
+          <w:kern w:val="0"/>
+          <w:sz w:val="21"/>
+          <w:szCs w:val="21"/>
+          <w14:ligatures w14:val="none"/>
+        </w:rPr>
+      </w:pPr>
+      <w:r>
+        <w:rPr>
+          <w:rFonts w:ascii="Consolas" w:eastAsia="Times New Roman" w:hAnsi="Consolas" w:cs="Times New Roman"/>
+          <w:color w:val="A5D6FF"/>
+          <w:kern w:val="0"/>
+          <w:sz w:val="21"/>
+          <w:szCs w:val="21"/>
+          <w14:ligatures w14:val="none"/>
+        </w:rPr>
+        <w:t>                FROM FantasyFootball.PlayerMatch PM</w:t>
+      </w:r>
+    </w:p>
+    <w:p>
+      <w:pPr>
+        <w:shd w:val="clear" w:color="auto" w:fill="121314"/>
+        <w:spacing w:after="0" w:line="285" w:lineRule="atLeast"/>
+        <w:ind w:left="360"/>
+        <w:rPr>
+          <w:rFonts w:ascii="Consolas" w:eastAsia="Times New Roman" w:hAnsi="Consolas" w:cs="Times New Roman"/>
+          <w:color w:val="BBBEBF"/>
+          <w:kern w:val="0"/>
+          <w:sz w:val="21"/>
+          <w:szCs w:val="21"/>
+          <w14:ligatures w14:val="none"/>
+        </w:rPr>
+      </w:pPr>
+      <w:r>
+        <w:rPr>
+          <w:rFonts w:ascii="Consolas" w:eastAsia="Times New Roman" w:hAnsi="Consolas" w:cs="Times New Roman"/>
+          <w:color w:val="A5D6FF"/>
+          <w:kern w:val="0"/>
+          <w:sz w:val="21"/>
+          <w:szCs w:val="21"/>
+          <w14:ligatures w14:val="none"/>
+        </w:rPr>
+        <w:t>                GROUP BY PM.MatchID, PM.TeamSeasonID</w:t>
+      </w:r>
+    </w:p>
+    <w:p>
+      <w:pPr>
+        <w:shd w:val="clear" w:color="auto" w:fill="121314"/>
+        <w:spacing w:after="0" w:line="285" w:lineRule="atLeast"/>
+        <w:ind w:left="360"/>
+        <w:rPr>
+          <w:rFonts w:ascii="Consolas" w:eastAsia="Times New Roman" w:hAnsi="Consolas" w:cs="Times New Roman"/>
+          <w:color w:val="BBBEBF"/>
+          <w:kern w:val="0"/>
+          <w:sz w:val="21"/>
+          <w:szCs w:val="21"/>
+          <w14:ligatures w14:val="none"/>
+        </w:rPr>
+      </w:pPr>
+      <w:r>
+        <w:rPr>
+          <w:rFonts w:ascii="Consolas" w:eastAsia="Times New Roman" w:hAnsi="Consolas" w:cs="Times New Roman"/>
+          <w:color w:val="A5D6FF"/>
+          <w:kern w:val="0"/>
+          <w:sz w:val="21"/>
+          <w:szCs w:val="21"/>
+          <w14:ligatures w14:val="none"/>
+        </w:rPr>
+        <w:t>           ) AMP ON AMP.MatchID = M.MatchID AND AMP.TeamSeasonID = AMT.TeamSeasonID</w:t>
+      </w:r>
+    </w:p>
+    <w:p>
+      <w:pPr>
+        <w:shd w:val="clear" w:color="auto" w:fill="121314"/>
+        <w:spacing w:after="0" w:line="285" w:lineRule="atLeast"/>
+        <w:ind w:left="360"/>
+        <w:rPr>
+          <w:rFonts w:ascii="Consolas" w:eastAsia="Times New Roman" w:hAnsi="Consolas" w:cs="Times New Roman"/>
+          <w:color w:val="BBBEBF"/>
+          <w:kern w:val="0"/>
+          <w:sz w:val="21"/>
+          <w:szCs w:val="21"/>
+          <w14:ligatures w14:val="none"/>
+        </w:rPr>
+      </w:pPr>
+      <w:r>
+        <w:rPr>
+          <w:rFonts w:ascii="Consolas" w:eastAsia="Times New Roman" w:hAnsi="Consolas" w:cs="Times New Roman"/>
+          <w:color w:val="A5D6FF"/>
+          <w:kern w:val="0"/>
+          <w:sz w:val="21"/>
+          <w:szCs w:val="21"/>
+          <w14:ligatures w14:val="none"/>
+        </w:rPr>
+        <w:t>           WHERE HMT.TeamSeasonID = ? OR AMT.TeamSeasonID = ?</w:t>
+      </w:r>
+    </w:p>
+    <w:p>
+      <w:pPr>
+        <w:shd w:val="clear" w:color="auto" w:fill="121314"/>
+        <w:spacing w:after="0" w:line="285" w:lineRule="atLeast"/>
+        <w:ind w:left="360"/>
+        <w:rPr>
+          <w:rFonts w:ascii="Consolas" w:eastAsia="Times New Roman" w:hAnsi="Consolas" w:cs="Times New Roman"/>
+          <w:color w:val="BBBEBF"/>
+          <w:kern w:val="0"/>
+          <w:sz w:val="21"/>
+          <w:szCs w:val="21"/>
+          <w14:ligatures w14:val="none"/>
+        </w:rPr>
+      </w:pPr>
+      <w:r>
+        <w:rPr>
+          <w:rFonts w:ascii="Consolas" w:eastAsia="Times New Roman" w:hAnsi="Consolas" w:cs="Times New Roman"/>
+          <w:color w:val="A5D6FF"/>
+          <w:kern w:val="0"/>
+          <w:sz w:val="21"/>
+          <w:szCs w:val="21"/>
+          <w14:ligatures w14:val="none"/>
+        </w:rPr>
+        <w:t>           ORDER BY</w:t>
+      </w:r>
+    </w:p>
+    <w:p>
+      <w:pPr>
+        <w:shd w:val="clear" w:color="auto" w:fill="121314"/>
+        <w:spacing w:after="0" w:line="285" w:lineRule="atLeast"/>
+        <w:ind w:left="360"/>
+        <w:rPr>
+          <w:rFonts w:ascii="Consolas" w:eastAsia="Times New Roman" w:hAnsi="Consolas" w:cs="Times New Roman"/>
+          <w:color w:val="BBBEBF"/>
+          <w:kern w:val="0"/>
+          <w:sz w:val="21"/>
+          <w:szCs w:val="21"/>
+          <w14:ligatures w14:val="none"/>
+        </w:rPr>
+      </w:pPr>
+      <w:r>
+        <w:rPr>
+          <w:rFonts w:ascii="Consolas" w:eastAsia="Times New Roman" w:hAnsi="Consolas" w:cs="Times New Roman"/>
+          <w:color w:val="A5D6FF"/>
+          <w:kern w:val="0"/>
+          <w:sz w:val="21"/>
+          <w:szCs w:val="21"/>
+          <w14:ligatures w14:val="none"/>
+        </w:rPr>
+        <w:t>                CASE</w:t>
+      </w:r>
+    </w:p>
+    <w:p>
+      <w:pPr>
+        <w:shd w:val="clear" w:color="auto" w:fill="121314"/>
+        <w:spacing w:after="0" w:line="285" w:lineRule="atLeast"/>
+        <w:ind w:left="360"/>
+        <w:rPr>
+          <w:rFonts w:ascii="Consolas" w:eastAsia="Times New Roman" w:hAnsi="Consolas" w:cs="Times New Roman"/>
+          <w:color w:val="BBBEBF"/>
+          <w:kern w:val="0"/>
+          <w:sz w:val="21"/>
+          <w:szCs w:val="21"/>
+          <w14:ligatures w14:val="none"/>
+        </w:rPr>
+      </w:pPr>
+      <w:r>
+        <w:rPr>
+          <w:rFonts w:ascii="Consolas" w:eastAsia="Times New Roman" w:hAnsi="Consolas" w:cs="Times New Roman"/>
+          <w:color w:val="A5D6FF"/>
+          <w:kern w:val="0"/>
+          <w:sz w:val="21"/>
+          <w:szCs w:val="21"/>
+          <w14:ligatures w14:val="none"/>
+        </w:rPr>
+        <w:t>                    WHEN HMT.TeamSeasonID = ?</w:t>
+      </w:r>
+    </w:p>
+    <w:p>
+      <w:pPr>
+        <w:shd w:val="clear" w:color="auto" w:fill="121314"/>
+        <w:spacing w:after="0" w:line="285" w:lineRule="atLeast"/>
+        <w:ind w:left="360"/>
+        <w:rPr>
+          <w:rFonts w:ascii="Consolas" w:eastAsia="Times New Roman" w:hAnsi="Consolas" w:cs="Times New Roman"/>
+          <w:color w:val="BBBEBF"/>
+          <w:kern w:val="0"/>
+          <w:sz w:val="21"/>
+          <w:szCs w:val="21"/>
+          <w14:ligatures w14:val="none"/>
+        </w:rPr>
+      </w:pPr>
+      <w:r>
+        <w:rPr>
+          <w:rFonts w:ascii="Consolas" w:eastAsia="Times New Roman" w:hAnsi="Consolas" w:cs="Times New Roman"/>
+          <w:color w:val="A5D6FF"/>
+          <w:kern w:val="0"/>
+          <w:sz w:val="21"/>
+          <w:szCs w:val="21"/>
+          <w14:ligatures w14:val="none"/>
+        </w:rPr>
+        <w:t>                        THEN COALESCE(HMP.Goals, 0) - COALESCE(AMP.Goals, 0)</w:t>
+      </w:r>
+    </w:p>
+    <w:p>
+      <w:pPr>
+        <w:shd w:val="clear" w:color="auto" w:fill="121314"/>
+        <w:spacing w:after="0" w:line="285" w:lineRule="atLeast"/>
+        <w:ind w:left="360"/>
+        <w:rPr>
+          <w:rFonts w:ascii="Consolas" w:eastAsia="Times New Roman" w:hAnsi="Consolas" w:cs="Times New Roman"/>
+          <w:color w:val="BBBEBF"/>
+          <w:kern w:val="0"/>
+          <w:sz w:val="21"/>
+          <w:szCs w:val="21"/>
+          <w14:ligatures w14:val="none"/>
+        </w:rPr>
+      </w:pPr>
+      <w:r>
+        <w:rPr>
+          <w:rFonts w:ascii="Consolas" w:eastAsia="Times New Roman" w:hAnsi="Consolas" w:cs="Times New Roman"/>
+          <w:color w:val="A5D6FF"/>
+          <w:kern w:val="0"/>
+          <w:sz w:val="21"/>
+          <w:szCs w:val="21"/>
+          <w14:ligatures w14:val="none"/>
+        </w:rPr>
+        <w:t>                    ELSE</w:t>
+      </w:r>
+    </w:p>
+    <w:p>
+      <w:pPr>
+        <w:shd w:val="clear" w:color="auto" w:fill="121314"/>
+        <w:spacing w:after="0" w:line="285" w:lineRule="atLeast"/>
+        <w:ind w:left="360"/>
+        <w:rPr>
+          <w:rFonts w:ascii="Consolas" w:eastAsia="Times New Roman" w:hAnsi="Consolas" w:cs="Times New Roman"/>
+          <w:color w:val="BBBEBF"/>
+          <w:kern w:val="0"/>
+          <w:sz w:val="21"/>
+          <w:szCs w:val="21"/>
+          <w14:ligatures w14:val="none"/>
+        </w:rPr>
+      </w:pPr>
+      <w:r>
+        <w:rPr>
+          <w:rFonts w:ascii="Consolas" w:eastAsia="Times New Roman" w:hAnsi="Consolas" w:cs="Times New Roman"/>
+          <w:color w:val="A5D6FF"/>
+          <w:kern w:val="0"/>
+          <w:sz w:val="21"/>
+          <w:szCs w:val="21"/>
+          <w14:ligatures w14:val="none"/>
+        </w:rPr>
+        <w:t>                        COALESCE(AMP.Goals, 0) - COALESCE(HMP.Goals, 0)</w:t>
+      </w:r>
+    </w:p>
+    <w:p>
+      <w:pPr>
+        <w:shd w:val="clear" w:color="auto" w:fill="121314"/>
+        <w:spacing w:after="0" w:line="285" w:lineRule="atLeast"/>
+        <w:ind w:left="360"/>
+        <w:rPr>
+          <w:rFonts w:ascii="Consolas" w:eastAsia="Times New Roman" w:hAnsi="Consolas" w:cs="Times New Roman"/>
+          <w:color w:val="BBBEBF"/>
+          <w:kern w:val="0"/>
+          <w:sz w:val="21"/>
+          <w:szCs w:val="21"/>
+          <w14:ligatures w14:val="none"/>
+        </w:rPr>
+      </w:pPr>
+      <w:r>
+        <w:rPr>
+          <w:rFonts w:ascii="Consolas" w:eastAsia="Times New Roman" w:hAnsi="Consolas" w:cs="Times New Roman"/>
+          <w:color w:val="A5D6FF"/>
+          <w:kern w:val="0"/>
+          <w:sz w:val="21"/>
+          <w:szCs w:val="21"/>
+          <w14:ligatures w14:val="none"/>
+        </w:rPr>
+        <w:t>                END DESC</w:t>
       </w:r>
     </w:p>
     <w:p>
@@ -302,40 +2763,117 @@
         <w:rPr>
           <w:rFonts w:ascii="Times New Roman" w:hAnsi="Times New Roman" w:cs="Times New Roman"/>
         </w:rPr>
-        <w:t xml:space="preserve">Artificial Intelligence was utilized throughout the project implementation. We used Claude AI from Anthropic. Claude AI was used to help set up the project initially by helping design the directory hierarchy. Then later on to debug any problems we ran into if we could not debug the code ourselves in a quick timeframe. </w:t>
-      </w:r>
-    </w:p>
-    <w:p>
-      <w:pPr>
-        <w:rPr>
-          <w:rFonts w:ascii="Times New Roman" w:hAnsi="Times New Roman" w:cs="Times New Roman"/>
-        </w:rPr>
-      </w:pPr>
-      <w:r>
-        <w:rPr>
-          <w:rFonts w:ascii="Times New Roman" w:hAnsi="Times New Roman" w:cs="Times New Roman"/>
-        </w:rPr>
-        <w:t xml:space="preserve">We found Claude AI to be exceptional for such minor tasks without many problems. This matched our expectations as we have heard companies that are hiring interns are using Claude AI as part of their job. </w:t>
-      </w:r>
-    </w:p>
-    <w:p>
-      <w:pPr>
-        <w:rPr>
-          <w:rFonts w:ascii="Times New Roman" w:hAnsi="Times New Roman" w:cs="Times New Roman"/>
-        </w:rPr>
-      </w:pPr>
-      <w:r>
-        <w:rPr>
-          <w:rFonts w:ascii="Times New Roman" w:hAnsi="Times New Roman" w:cs="Times New Roman"/>
-        </w:rPr>
-        <w:t xml:space="preserve">There are a few shortcomings when using these tools. Sometimes in debugging it would try and change the code to “fix” the issue, instead of identifying the problem. If we tried using the new code it would cause other issues because it would not match up with something in the backend or frontend, depending on where the issue originates from. Also it is very difficult to debug code </w:t>
-      </w:r>
-      <w:r>
-        <w:rPr>
-          <w:rFonts w:ascii="Times New Roman" w:hAnsi="Times New Roman" w:cs="Times New Roman"/>
-        </w:rPr>
-        <w:lastRenderedPageBreak/>
-        <w:t xml:space="preserve">that you do not look at so we tried to keep the coding aspect of the project to a minimal with the exception of helping writing a script to read csv files into our database. </w:t>
+        <w:t>Artificial Intelligence was utilized throughout the project implementation. We used Claude AI from Anthropic. Claude AI was used to help set up the project initially by helping design the directory hierarchy. Then</w:t>
+      </w:r>
+      <w:r>
+        <w:rPr>
+          <w:rFonts w:ascii="Times New Roman" w:hAnsi="Times New Roman" w:cs="Times New Roman"/>
+        </w:rPr>
+        <w:t>, later on, to debug any problems we ran into,</w:t>
+      </w:r>
+      <w:r>
+        <w:rPr>
+          <w:rFonts w:ascii="Times New Roman" w:hAnsi="Times New Roman" w:cs="Times New Roman"/>
+        </w:rPr>
+        <w:t xml:space="preserve"> if we could not debug the code ourselves in a quick timeframe. </w:t>
+      </w:r>
+    </w:p>
+    <w:p>
+      <w:pPr>
+        <w:rPr>
+          <w:rFonts w:ascii="Times New Roman" w:hAnsi="Times New Roman" w:cs="Times New Roman"/>
+        </w:rPr>
+      </w:pPr>
+      <w:r>
+        <w:rPr>
+          <w:rFonts w:ascii="Times New Roman" w:hAnsi="Times New Roman" w:cs="Times New Roman"/>
+        </w:rPr>
+        <w:t>We found Claude AI to be exceptional for such minor tasks</w:t>
+      </w:r>
+      <w:r>
+        <w:rPr>
+          <w:rFonts w:ascii="Times New Roman" w:hAnsi="Times New Roman" w:cs="Times New Roman"/>
+        </w:rPr>
+        <w:t>, with few</w:t>
+      </w:r>
+      <w:r>
+        <w:rPr>
+          <w:rFonts w:ascii="Times New Roman" w:hAnsi="Times New Roman" w:cs="Times New Roman"/>
+        </w:rPr>
+        <w:t xml:space="preserve"> problems. This matched our expectations</w:t>
+      </w:r>
+      <w:r>
+        <w:rPr>
+          <w:rFonts w:ascii="Times New Roman" w:hAnsi="Times New Roman" w:cs="Times New Roman"/>
+        </w:rPr>
+        <w:t>,</w:t>
+      </w:r>
+      <w:r>
+        <w:rPr>
+          <w:rFonts w:ascii="Times New Roman" w:hAnsi="Times New Roman" w:cs="Times New Roman"/>
+        </w:rPr>
+        <w:t xml:space="preserve"> as we have heard </w:t>
+      </w:r>
+      <w:r>
+        <w:rPr>
+          <w:rFonts w:ascii="Times New Roman" w:hAnsi="Times New Roman" w:cs="Times New Roman"/>
+        </w:rPr>
+        <w:t>that companies hiring interns are using Claude AI as part of the</w:t>
+      </w:r>
+      <w:r>
+        <w:rPr>
+          <w:rFonts w:ascii="Times New Roman" w:hAnsi="Times New Roman" w:cs="Times New Roman"/>
+        </w:rPr>
+        <w:t xml:space="preserve"> job. </w:t>
+      </w:r>
+    </w:p>
+    <w:p>
+      <w:pPr>
+        <w:rPr>
+          <w:rFonts w:ascii="Times New Roman" w:hAnsi="Times New Roman" w:cs="Times New Roman"/>
+        </w:rPr>
+      </w:pPr>
+      <w:r>
+        <w:rPr>
+          <w:rFonts w:ascii="Times New Roman" w:hAnsi="Times New Roman" w:cs="Times New Roman"/>
+        </w:rPr>
+        <w:t>There are a few shortcomings when using these tools. Sometimes</w:t>
+      </w:r>
+      <w:r>
+        <w:rPr>
+          <w:rFonts w:ascii="Times New Roman" w:hAnsi="Times New Roman" w:cs="Times New Roman"/>
+        </w:rPr>
+        <w:t>, during debugging, it tries to change the code to “fix” the issue</w:t>
+      </w:r>
+      <w:r>
+        <w:rPr>
+          <w:rFonts w:ascii="Times New Roman" w:hAnsi="Times New Roman" w:cs="Times New Roman"/>
+        </w:rPr>
+        <w:t xml:space="preserve"> instead of identifying the problem. If we tried using the new code</w:t>
+      </w:r>
+      <w:r>
+        <w:rPr>
+          <w:rFonts w:ascii="Times New Roman" w:hAnsi="Times New Roman" w:cs="Times New Roman"/>
+        </w:rPr>
+        <w:t>,</w:t>
+      </w:r>
+      <w:r>
+        <w:rPr>
+          <w:rFonts w:ascii="Times New Roman" w:hAnsi="Times New Roman" w:cs="Times New Roman"/>
+        </w:rPr>
+        <w:t xml:space="preserve"> it would cause other issues because it would not match up with something in the backend or frontend, depending on where the issue originates from. Also</w:t>
+      </w:r>
+      <w:r>
+        <w:rPr>
+          <w:rFonts w:ascii="Times New Roman" w:hAnsi="Times New Roman" w:cs="Times New Roman"/>
+        </w:rPr>
+        <w:t>, it is very difficult to debug code you do not look at, so we tried to keep the coding aspect of the project to a minimum, with the exception of helping to write a script to load CSV</w:t>
+      </w:r>
+      <w:r>
+        <w:rPr>
+          <w:rFonts w:ascii="Times New Roman" w:hAnsi="Times New Roman" w:cs="Times New Roman"/>
+        </w:rPr>
+        <w:t xml:space="preserve"> files into our database. </w:t>
       </w:r>
     </w:p>
     <w:p>
@@ -382,6 +2920,103 @@
     </w:sectPr>
   </w:body>
 </w:document>
+</file>
+
+<file path=word/numbering.xml><?xml version="1.0" encoding="utf-8"?>
+<w:numbering xmlns:wpc="http://schemas.microsoft.com/office/word/2010/wordprocessingCanvas" xmlns:cx="http://schemas.microsoft.com/office/drawing/2014/chartex" xmlns:cx1="http://schemas.microsoft.com/office/drawing/2015/9/8/chartex" xmlns:cx2="http://schemas.microsoft.com/office/drawing/2015/10/21/chartex" xmlns:cx3="http://schemas.microsoft.com/office/drawing/2016/5/9/chartex" xmlns:cx4="http://schemas.microsoft.com/office/drawing/2016/5/10/chartex" xmlns:cx5="http://schemas.microsoft.com/office/drawing/2016/5/11/chartex" xmlns:cx6="http://schemas.microsoft.com/office/drawing/2016/5/12/chartex" xmlns:cx7="http://schemas.microsoft.com/office/drawing/2016/5/13/chartex" xmlns:cx8="http://schemas.microsoft.com/office/drawing/2016/5/14/chartex" xmlns:mc="http://schemas.openxmlformats.org/markup-compatibility/2006" xmlns:aink="http://schemas.microsoft.com/office/drawing/2016/ink" xmlns:am3d="http://schemas.microsoft.com/office/drawing/2017/model3d" xmlns:o="urn:schemas-microsoft-com:office:office" xmlns:oel="http://schemas.microsoft.com/office/2019/extlst" xmlns:r="http://schemas.openxmlformats.org/officeDocument/2006/relationships" xmlns:m="http://schemas.openxmlformats.org/officeDocument/2006/math" xmlns:v="urn:schemas-microsoft-com:vml" xmlns:wp14="http://schemas.microsoft.com/office/word/2010/wordprocessingDrawing" xmlns:wp="http://schemas.openxmlformats.org/drawingml/2006/wordprocessingDrawing" xmlns:w10="urn:schemas-microsoft-com:office:word" xmlns:w="http://schemas.openxmlformats.org/wordprocessingml/2006/main" xmlns:w14="http://schemas.microsoft.com/office/word/2010/wordml" xmlns:w15="http://schemas.microsoft.com/office/word/2012/wordml" xmlns:w16cex="http://schemas.microsoft.com/office/word/2018/wordml/cex" xmlns:w16cid="http://schemas.microsoft.com/office/word/2016/wordml/cid" xmlns:w16="http://schemas.microsoft.com/office/word/2018/wordml" xmlns:w16du="http://schemas.microsoft.com/office/word/2023/wordml/word16du" xmlns:w16sdtdh="http://schemas.microsoft.com/office/word/2020/wordml/sdtdatahash" xmlns:w16sdtfl="http://schemas.microsoft.com/office/word/2024/wordml/sdtformatlock" xmlns:w16se="http://schemas.microsoft.com/office/word/2015/wordml/symex" xmlns:wpg="http://schemas.microsoft.com/office/word/2010/wordprocessingGroup" xmlns:wpi="http://schemas.microsoft.com/office/word/2010/wordprocessingInk" xmlns:wne="http://schemas.microsoft.com/office/word/2006/wordml" xmlns:wps="http://schemas.microsoft.com/office/word/2010/wordprocessingShape" mc:Ignorable="w14 w15 w16se w16cid w16 w16cex w16sdtdh w16sdtfl w16du wp14">
+  <w:abstractNum w:abstractNumId="0" w15:restartNumberingAfterBreak="0">
+    <w:nsid w:val="4F110223"/>
+    <w:multiLevelType w:val="hybridMultilevel"/>
+    <w:tmpl w:val="310618BC"/>
+    <w:lvl w:ilvl="0" w:tplc="04090011">
+      <w:start w:val="1"/>
+      <w:numFmt w:val="decimal"/>
+      <w:lvlText w:val="%1)"/>
+      <w:lvlJc w:val="left"/>
+      <w:pPr>
+        <w:ind w:left="720" w:hanging="360"/>
+      </w:pPr>
+      <w:rPr>
+        <w:rFonts w:hint="default"/>
+      </w:rPr>
+    </w:lvl>
+    <w:lvl w:ilvl="1" w:tplc="04090019" w:tentative="1">
+      <w:start w:val="1"/>
+      <w:numFmt w:val="lowerLetter"/>
+      <w:lvlText w:val="%2."/>
+      <w:lvlJc w:val="left"/>
+      <w:pPr>
+        <w:ind w:left="1440" w:hanging="360"/>
+      </w:pPr>
+    </w:lvl>
+    <w:lvl w:ilvl="2" w:tplc="0409001B" w:tentative="1">
+      <w:start w:val="1"/>
+      <w:numFmt w:val="lowerRoman"/>
+      <w:lvlText w:val="%3."/>
+      <w:lvlJc w:val="right"/>
+      <w:pPr>
+        <w:ind w:left="2160" w:hanging="180"/>
+      </w:pPr>
+    </w:lvl>
+    <w:lvl w:ilvl="3" w:tplc="0409000F" w:tentative="1">
+      <w:start w:val="1"/>
+      <w:numFmt w:val="decimal"/>
+      <w:lvlText w:val="%4."/>
+      <w:lvlJc w:val="left"/>
+      <w:pPr>
+        <w:ind w:left="2880" w:hanging="360"/>
+      </w:pPr>
+    </w:lvl>
+    <w:lvl w:ilvl="4" w:tplc="04090019" w:tentative="1">
+      <w:start w:val="1"/>
+      <w:numFmt w:val="lowerLetter"/>
+      <w:lvlText w:val="%5."/>
+      <w:lvlJc w:val="left"/>
+      <w:pPr>
+        <w:ind w:left="3600" w:hanging="360"/>
+      </w:pPr>
+    </w:lvl>
+    <w:lvl w:ilvl="5" w:tplc="0409001B" w:tentative="1">
+      <w:start w:val="1"/>
+      <w:numFmt w:val="lowerRoman"/>
+      <w:lvlText w:val="%6."/>
+      <w:lvlJc w:val="right"/>
+      <w:pPr>
+        <w:ind w:left="4320" w:hanging="180"/>
+      </w:pPr>
+    </w:lvl>
+    <w:lvl w:ilvl="6" w:tplc="0409000F" w:tentative="1">
+      <w:start w:val="1"/>
+      <w:numFmt w:val="decimal"/>
+      <w:lvlText w:val="%7."/>
+      <w:lvlJc w:val="left"/>
+      <w:pPr>
+        <w:ind w:left="5040" w:hanging="360"/>
+      </w:pPr>
+    </w:lvl>
+    <w:lvl w:ilvl="7" w:tplc="04090019" w:tentative="1">
+      <w:start w:val="1"/>
+      <w:numFmt w:val="lowerLetter"/>
+      <w:lvlText w:val="%8."/>
+      <w:lvlJc w:val="left"/>
+      <w:pPr>
+        <w:ind w:left="5760" w:hanging="360"/>
+      </w:pPr>
+    </w:lvl>
+    <w:lvl w:ilvl="8" w:tplc="0409001B" w:tentative="1">
+      <w:start w:val="1"/>
+      <w:numFmt w:val="lowerRoman"/>
+      <w:lvlText w:val="%9."/>
+      <w:lvlJc w:val="right"/>
+      <w:pPr>
+        <w:ind w:left="6480" w:hanging="180"/>
+      </w:pPr>
+    </w:lvl>
+  </w:abstractNum>
+  <w:num w:numId="1" w16cid:durableId="1249583142">
+    <w:abstractNumId w:val="0"/>
+  </w:num>
+</w:numbering>
 </file>
 
 <file path=word/styles.xml><?xml version="1.0" encoding="utf-8"?>

</xml_diff>